<commit_message>
Solucionario de Software 1.º en oficio (17 págs.) y skill actualizada
- Solucionario: oficio, márgenes estrechos, tablas a la ventana, índice verificado,
  0 páginas casi vacías (interlineado 0,95 en dos bloques).
- Muestra regenerada; informe 05_RESPUESTA actualizado (117 controles, 0 fallos).
- Skill: el Solucionario va en oficio; paginacion.py con un 4.º nivel de interlineado.

Co-Authored-By: Claude Opus 5.5 <noreply@anthropic.com>
Claude-Session: https://claude.ai/code/session_012pzpEV746W2Xyeg29Pf1vY
</commit_message>
<xml_diff>
--- a/Software_1er_Curso/Gabinete_Informatica_Software_1er_Curso_SOLUCIONARIO_DOCENTE_ESENCIAL_COMERCIAL_2026.docx
+++ b/Software_1er_Curso/Gabinete_Informatica_Software_1er_Curso_SOLUCIONARIO_DOCENTE_ESENCIAL_COMERCIAL_2026.docx
@@ -16,7 +16,7 @@
             <wp:positionV relativeFrom="page">
               <wp:posOffset>0</wp:posOffset>
             </wp:positionV>
-            <wp:extent cx="7560310" cy="10692130"/>
+            <wp:extent cx="7772400" cy="11887200"/>
             <wp:effectExtent l="0" t="0" r="0" b="0"/>
             <wp:wrapNone/>
             <wp:docPr id="1" name="Portada" descr="Portada: Solucionario, Gabinete de Informática – Software, 1.er Curso"/>
@@ -39,7 +39,7 @@
                   <pic:spPr>
                     <a:xfrm>
                       <a:off x="0" y="0"/>
-                      <a:ext cx="7560310" cy="10692130"/>
+                      <a:ext cx="7772400" cy="11887200"/>
                     </a:xfrm>
                     <a:prstGeom prst="rect">
                       <a:avLst/>
@@ -102,20 +102,8 @@
     </w:p>
     <w:p>
       <w:pPr>
-        <w:rPr>
-          <w:lang w:val="es-PY"/>
-        </w:rPr>
-      </w:pPr>
-      <w:r>
-        <w:rPr>
-          <w:lang w:val="es-PY"/>
-        </w:rPr>
-        <w:br w:type="page"/>
-      </w:r>
-    </w:p>
-    <w:p>
-      <w:pPr>
         <w:pStyle w:val="TituloPreliminar"/>
+        <w:pageBreakBefore/>
         <w:rPr>
           <w:lang w:val="es-PY"/>
         </w:rPr>
@@ -262,7 +250,7 @@
         <w:tab/>
       </w:r>
       <w:r>
-        <w:t>7</w:t>
+        <w:t>6</w:t>
       </w:r>
     </w:p>
     <w:p>
@@ -302,7 +290,7 @@
         <w:tab/>
       </w:r>
       <w:r>
-        <w:t>8</w:t>
+        <w:t>7</w:t>
       </w:r>
     </w:p>
     <w:p>
@@ -322,7 +310,7 @@
         <w:tab/>
       </w:r>
       <w:r>
-        <w:t>8</w:t>
+        <w:t>7</w:t>
       </w:r>
     </w:p>
     <w:p>
@@ -362,7 +350,7 @@
         <w:tab/>
       </w:r>
       <w:r>
-        <w:t>9</w:t>
+        <w:t>8</w:t>
       </w:r>
     </w:p>
     <w:p>
@@ -382,7 +370,7 @@
         <w:tab/>
       </w:r>
       <w:r>
-        <w:t>9</w:t>
+        <w:t>8</w:t>
       </w:r>
     </w:p>
     <w:p>
@@ -402,7 +390,7 @@
         <w:tab/>
       </w:r>
       <w:r>
-        <w:t>10</w:t>
+        <w:t>9</w:t>
       </w:r>
     </w:p>
     <w:p>
@@ -422,7 +410,7 @@
         <w:tab/>
       </w:r>
       <w:r>
-        <w:t>10</w:t>
+        <w:t>9</w:t>
       </w:r>
     </w:p>
     <w:p>
@@ -442,7 +430,7 @@
         <w:tab/>
       </w:r>
       <w:r>
-        <w:t>10</w:t>
+        <w:t>9</w:t>
       </w:r>
     </w:p>
     <w:p>
@@ -462,7 +450,7 @@
         <w:tab/>
       </w:r>
       <w:r>
-        <w:t>11</w:t>
+        <w:t>9</w:t>
       </w:r>
     </w:p>
     <w:p>
@@ -482,7 +470,7 @@
         <w:tab/>
       </w:r>
       <w:r>
-        <w:t>11</w:t>
+        <w:t>10</w:t>
       </w:r>
     </w:p>
     <w:p>
@@ -502,7 +490,7 @@
         <w:tab/>
       </w:r>
       <w:r>
-        <w:t>12</w:t>
+        <w:t>10</w:t>
       </w:r>
     </w:p>
     <w:p>
@@ -522,7 +510,7 @@
         <w:tab/>
       </w:r>
       <w:r>
-        <w:t>12</w:t>
+        <w:t>10</w:t>
       </w:r>
     </w:p>
     <w:p>
@@ -542,7 +530,7 @@
         <w:tab/>
       </w:r>
       <w:r>
-        <w:t>13</w:t>
+        <w:t>11</w:t>
       </w:r>
     </w:p>
     <w:p>
@@ -562,7 +550,7 @@
         <w:tab/>
       </w:r>
       <w:r>
-        <w:t>13</w:t>
+        <w:t>11</w:t>
       </w:r>
     </w:p>
     <w:p>
@@ -582,7 +570,7 @@
         <w:tab/>
       </w:r>
       <w:r>
-        <w:t>13</w:t>
+        <w:t>11</w:t>
       </w:r>
     </w:p>
     <w:p>
@@ -602,7 +590,7 @@
         <w:tab/>
       </w:r>
       <w:r>
-        <w:t>14</w:t>
+        <w:t>11</w:t>
       </w:r>
     </w:p>
     <w:p>
@@ -622,7 +610,7 @@
         <w:tab/>
       </w:r>
       <w:r>
-        <w:t>14</w:t>
+        <w:t>12</w:t>
       </w:r>
     </w:p>
     <w:p>
@@ -642,7 +630,7 @@
         <w:tab/>
       </w:r>
       <w:r>
-        <w:t>15</w:t>
+        <w:t>12</w:t>
       </w:r>
     </w:p>
     <w:p>
@@ -666,7 +654,7 @@
         <w:tab/>
       </w:r>
       <w:r>
-        <w:t>16</w:t>
+        <w:t>13</w:t>
       </w:r>
     </w:p>
     <w:p>
@@ -686,7 +674,7 @@
         <w:tab/>
       </w:r>
       <w:r>
-        <w:t>16</w:t>
+        <w:t>13</w:t>
       </w:r>
     </w:p>
     <w:p>
@@ -706,7 +694,7 @@
         <w:tab/>
       </w:r>
       <w:r>
-        <w:t>16</w:t>
+        <w:t>13</w:t>
       </w:r>
     </w:p>
     <w:p>
@@ -726,7 +714,7 @@
         <w:tab/>
       </w:r>
       <w:r>
-        <w:t>16</w:t>
+        <w:t>13</w:t>
       </w:r>
     </w:p>
     <w:p>
@@ -746,7 +734,7 @@
         <w:tab/>
       </w:r>
       <w:r>
-        <w:t>16</w:t>
+        <w:t>13</w:t>
       </w:r>
     </w:p>
     <w:p>
@@ -766,7 +754,7 @@
         <w:tab/>
       </w:r>
       <w:r>
-        <w:t>17</w:t>
+        <w:t>13</w:t>
       </w:r>
     </w:p>
     <w:p>
@@ -790,7 +778,7 @@
         <w:tab/>
       </w:r>
       <w:r>
-        <w:t>18</w:t>
+        <w:t>14</w:t>
       </w:r>
     </w:p>
     <w:p>
@@ -810,7 +798,7 @@
         <w:tab/>
       </w:r>
       <w:r>
-        <w:t>18</w:t>
+        <w:t>14</w:t>
       </w:r>
     </w:p>
     <w:p>
@@ -830,7 +818,7 @@
         <w:tab/>
       </w:r>
       <w:r>
-        <w:t>18</w:t>
+        <w:t>14</w:t>
       </w:r>
     </w:p>
     <w:p>
@@ -850,7 +838,7 @@
         <w:tab/>
       </w:r>
       <w:r>
-        <w:t>18</w:t>
+        <w:t>14</w:t>
       </w:r>
     </w:p>
     <w:p>
@@ -870,7 +858,7 @@
         <w:tab/>
       </w:r>
       <w:r>
-        <w:t>18</w:t>
+        <w:t>14</w:t>
       </w:r>
     </w:p>
     <w:p>
@@ -890,7 +878,7 @@
         <w:tab/>
       </w:r>
       <w:r>
-        <w:t>18</w:t>
+        <w:t>14</w:t>
       </w:r>
     </w:p>
     <w:p>
@@ -910,7 +898,7 @@
         <w:tab/>
       </w:r>
       <w:r>
-        <w:t>18</w:t>
+        <w:t>14</w:t>
       </w:r>
     </w:p>
     <w:p>
@@ -930,7 +918,7 @@
         <w:tab/>
       </w:r>
       <w:r>
-        <w:t>18</w:t>
+        <w:t>14</w:t>
       </w:r>
     </w:p>
     <w:p>
@@ -950,7 +938,7 @@
         <w:tab/>
       </w:r>
       <w:r>
-        <w:t>18</w:t>
+        <w:t>14</w:t>
       </w:r>
     </w:p>
     <w:p>
@@ -970,7 +958,7 @@
         <w:tab/>
       </w:r>
       <w:r>
-        <w:t>18</w:t>
+        <w:t>14</w:t>
       </w:r>
     </w:p>
     <w:p>
@@ -990,7 +978,7 @@
         <w:tab/>
       </w:r>
       <w:r>
-        <w:t>18</w:t>
+        <w:t>14</w:t>
       </w:r>
     </w:p>
     <w:p>
@@ -1010,7 +998,7 @@
         <w:tab/>
       </w:r>
       <w:r>
-        <w:t>18</w:t>
+        <w:t>14</w:t>
       </w:r>
     </w:p>
     <w:p>
@@ -1030,7 +1018,7 @@
         <w:tab/>
       </w:r>
       <w:r>
-        <w:t>19</w:t>
+        <w:t>14</w:t>
       </w:r>
     </w:p>
     <w:p>
@@ -1050,7 +1038,7 @@
         <w:tab/>
       </w:r>
       <w:r>
-        <w:t>19</w:t>
+        <w:t>14</w:t>
       </w:r>
     </w:p>
     <w:p>
@@ -1070,7 +1058,7 @@
         <w:tab/>
       </w:r>
       <w:r>
-        <w:t>19</w:t>
+        <w:t>14</w:t>
       </w:r>
     </w:p>
     <w:p>
@@ -1090,7 +1078,7 @@
         <w:tab/>
       </w:r>
       <w:r>
-        <w:t>19</w:t>
+        <w:t>14</w:t>
       </w:r>
     </w:p>
     <w:p>
@@ -1110,7 +1098,7 @@
         <w:tab/>
       </w:r>
       <w:r>
-        <w:t>19</w:t>
+        <w:t>15</w:t>
       </w:r>
     </w:p>
     <w:p>
@@ -1130,7 +1118,7 @@
         <w:tab/>
       </w:r>
       <w:r>
-        <w:t>19</w:t>
+        <w:t>15</w:t>
       </w:r>
     </w:p>
     <w:p>
@@ -1150,7 +1138,7 @@
         <w:tab/>
       </w:r>
       <w:r>
-        <w:t>19</w:t>
+        <w:t>15</w:t>
       </w:r>
     </w:p>
     <w:p>
@@ -1170,7 +1158,7 @@
         <w:tab/>
       </w:r>
       <w:r>
-        <w:t>19</w:t>
+        <w:t>15</w:t>
       </w:r>
     </w:p>
     <w:p>
@@ -1190,7 +1178,7 @@
         <w:tab/>
       </w:r>
       <w:r>
-        <w:t>19</w:t>
+        <w:t>15</w:t>
       </w:r>
     </w:p>
     <w:p>
@@ -1214,7 +1202,7 @@
         <w:tab/>
       </w:r>
       <w:r>
-        <w:t>20</w:t>
+        <w:t>15</w:t>
       </w:r>
     </w:p>
     <w:p>
@@ -1238,7 +1226,7 @@
         <w:tab/>
       </w:r>
       <w:r>
-        <w:t>21</w:t>
+        <w:t>16</w:t>
       </w:r>
     </w:p>
     <w:p>
@@ -1258,7 +1246,7 @@
         <w:tab/>
       </w:r>
       <w:r>
-        <w:t>21</w:t>
+        <w:t>16</w:t>
       </w:r>
     </w:p>
     <w:p>
@@ -1278,7 +1266,7 @@
         <w:tab/>
       </w:r>
       <w:r>
-        <w:t>21</w:t>
+        <w:t>16</w:t>
       </w:r>
     </w:p>
     <w:p>
@@ -1298,7 +1286,7 @@
         <w:tab/>
       </w:r>
       <w:r>
-        <w:t>21</w:t>
+        <w:t>16</w:t>
       </w:r>
     </w:p>
     <w:p>
@@ -1318,7 +1306,7 @@
         <w:tab/>
       </w:r>
       <w:r>
-        <w:t>21</w:t>
+        <w:t>16</w:t>
       </w:r>
     </w:p>
     <w:p>
@@ -1338,7 +1326,7 @@
         <w:tab/>
       </w:r>
       <w:r>
-        <w:t>21</w:t>
+        <w:t>16</w:t>
       </w:r>
     </w:p>
     <w:p>
@@ -1358,7 +1346,7 @@
         <w:tab/>
       </w:r>
       <w:r>
-        <w:t>21</w:t>
+        <w:t>16</w:t>
       </w:r>
     </w:p>
     <w:p>
@@ -1378,7 +1366,7 @@
         <w:tab/>
       </w:r>
       <w:r>
-        <w:t>21</w:t>
+        <w:t>16</w:t>
       </w:r>
     </w:p>
     <w:p>
@@ -1398,7 +1386,7 @@
         <w:tab/>
       </w:r>
       <w:r>
-        <w:t>22</w:t>
+        <w:t>16</w:t>
       </w:r>
     </w:p>
     <w:p>
@@ -1418,7 +1406,7 @@
         <w:tab/>
       </w:r>
       <w:r>
-        <w:t>22</w:t>
+        <w:t>16</w:t>
       </w:r>
     </w:p>
     <w:p>
@@ -1438,7 +1426,7 @@
         <w:tab/>
       </w:r>
       <w:r>
-        <w:t>22</w:t>
+        <w:t>17</w:t>
       </w:r>
     </w:p>
     <w:p>
@@ -1458,20 +1446,16 @@
         <w:tab/>
       </w:r>
       <w:r>
-        <w:t>22</w:t>
+        <w:t>17</w:t>
       </w:r>
       <w:r>
         <w:fldChar w:fldCharType="end"/>
       </w:r>
     </w:p>
     <w:p>
-      <w:r>
-        <w:br w:type="page"/>
-      </w:r>
-    </w:p>
-    <w:p>
       <w:pPr>
         <w:pStyle w:val="Ttulo1"/>
+        <w:pageBreakBefore/>
         <w:rPr>
           <w:lang w:val="es-PY"/>
         </w:rPr>
@@ -1646,20 +1630,9 @@
     </w:p>
     <w:p>
       <w:pPr>
-        <w:rPr>
-          <w:lang w:val="es-PY"/>
-        </w:rPr>
-      </w:pPr>
-      <w:r>
-        <w:rPr>
-          <w:lang w:val="es-PY"/>
-        </w:rPr>
-        <w:br w:type="page"/>
-      </w:r>
-    </w:p>
-    <w:p>
-      <w:pPr>
         <w:pStyle w:val="Ttulo1"/>
+        <w:pageBreakBefore/>
+        <w:spacing w:after="30"/>
         <w:rPr>
           <w:lang w:val="es-PY"/>
         </w:rPr>
@@ -1675,6 +1648,7 @@
     <w:p>
       <w:pPr>
         <w:pStyle w:val="Ttulo2"/>
+        <w:spacing w:after="30"/>
         <w:rPr>
           <w:lang w:val="es-PY"/>
         </w:rPr>
@@ -1689,6 +1663,7 @@
     <w:p>
       <w:pPr>
         <w:pStyle w:val="Ttulo3"/>
+        <w:spacing w:after="30"/>
         <w:rPr>
           <w:lang w:val="es-PY"/>
         </w:rPr>
@@ -1702,6 +1677,7 @@
     </w:p>
     <w:p>
       <w:pPr>
+        <w:spacing w:after="30"/>
         <w:rPr>
           <w:lang w:val="es-PY"/>
         </w:rPr>
@@ -1717,6 +1693,7 @@
     </w:p>
     <w:p>
       <w:pPr>
+        <w:spacing w:after="30"/>
         <w:rPr>
           <w:lang w:val="es-PY"/>
         </w:rPr>
@@ -1731,6 +1708,7 @@
     </w:p>
     <w:p>
       <w:pPr>
+        <w:spacing w:after="30"/>
         <w:rPr>
           <w:lang w:val="es-PY"/>
         </w:rPr>
@@ -1745,6 +1723,7 @@
     </w:p>
     <w:p>
       <w:pPr>
+        <w:spacing w:after="30"/>
         <w:rPr>
           <w:lang w:val="es-PY"/>
         </w:rPr>
@@ -1759,6 +1738,7 @@
     </w:p>
     <w:p>
       <w:pPr>
+        <w:spacing w:after="30"/>
         <w:rPr>
           <w:lang w:val="es-PY"/>
         </w:rPr>
@@ -1773,6 +1753,7 @@
     </w:p>
     <w:p>
       <w:pPr>
+        <w:spacing w:after="30"/>
         <w:rPr>
           <w:lang w:val="es-PY"/>
         </w:rPr>
@@ -1788,6 +1769,7 @@
     </w:p>
     <w:p>
       <w:pPr>
+        <w:spacing w:after="30"/>
         <w:rPr>
           <w:lang w:val="es-PY"/>
         </w:rPr>
@@ -1802,6 +1784,7 @@
     </w:p>
     <w:p>
       <w:pPr>
+        <w:spacing w:after="30"/>
         <w:rPr>
           <w:lang w:val="es-PY"/>
         </w:rPr>
@@ -1816,6 +1799,7 @@
     </w:p>
     <w:p>
       <w:pPr>
+        <w:spacing w:after="30"/>
         <w:rPr>
           <w:lang w:val="es-PY"/>
         </w:rPr>
@@ -1830,6 +1814,8 @@
     </w:p>
     <w:p>
       <w:pPr>
+        <w:keepNext/>
+        <w:spacing w:after="30"/>
         <w:rPr>
           <w:lang w:val="es-PY"/>
         </w:rPr>
@@ -1845,6 +1831,7 @@
     </w:p>
     <w:p>
       <w:pPr>
+        <w:spacing w:after="30"/>
         <w:rPr>
           <w:lang w:val="es-PY"/>
         </w:rPr>
@@ -1859,6 +1846,7 @@
     </w:p>
     <w:p>
       <w:pPr>
+        <w:spacing w:after="30"/>
         <w:rPr>
           <w:lang w:val="es-PY"/>
         </w:rPr>
@@ -1873,6 +1861,7 @@
     </w:p>
     <w:p>
       <w:pPr>
+        <w:spacing w:after="30"/>
         <w:rPr>
           <w:lang w:val="es-PY"/>
         </w:rPr>
@@ -1887,6 +1876,8 @@
     </w:p>
     <w:p>
       <w:pPr>
+        <w:keepNext/>
+        <w:spacing w:after="30"/>
         <w:rPr>
           <w:lang w:val="es-PY"/>
         </w:rPr>
@@ -1930,6 +1921,7 @@
     </w:p>
     <w:p>
       <w:pPr>
+        <w:spacing w:after="30"/>
         <w:rPr>
           <w:lang w:val="es-PY"/>
         </w:rPr>
@@ -1944,6 +1936,7 @@
     </w:p>
     <w:p>
       <w:pPr>
+        <w:spacing w:after="30"/>
         <w:rPr>
           <w:lang w:val="es-PY"/>
         </w:rPr>
@@ -1959,6 +1952,7 @@
     <w:p>
       <w:pPr>
         <w:pStyle w:val="Ttulo3"/>
+        <w:spacing w:after="30"/>
         <w:rPr>
           <w:lang w:val="es-PY"/>
         </w:rPr>
@@ -1972,6 +1966,7 @@
     </w:p>
     <w:p>
       <w:pPr>
+        <w:spacing w:after="30"/>
         <w:rPr>
           <w:lang w:val="es-PY"/>
         </w:rPr>
@@ -1987,6 +1982,7 @@
     </w:p>
     <w:p>
       <w:pPr>
+        <w:spacing w:after="30"/>
         <w:rPr>
           <w:lang w:val="es-PY"/>
         </w:rPr>
@@ -2001,6 +1997,7 @@
     </w:p>
     <w:p>
       <w:pPr>
+        <w:spacing w:after="30"/>
         <w:rPr>
           <w:lang w:val="es-PY"/>
         </w:rPr>
@@ -2015,6 +2012,7 @@
     </w:p>
     <w:p>
       <w:pPr>
+        <w:spacing w:after="30"/>
         <w:rPr>
           <w:lang w:val="es-PY"/>
         </w:rPr>
@@ -2029,6 +2027,7 @@
     </w:p>
     <w:p>
       <w:pPr>
+        <w:spacing w:after="30"/>
         <w:rPr>
           <w:lang w:val="es-PY"/>
         </w:rPr>
@@ -2043,6 +2042,7 @@
     </w:p>
     <w:p>
       <w:pPr>
+        <w:spacing w:after="30"/>
         <w:rPr>
           <w:lang w:val="es-PY"/>
         </w:rPr>
@@ -2058,6 +2058,7 @@
     </w:p>
     <w:p>
       <w:pPr>
+        <w:spacing w:after="30"/>
         <w:rPr>
           <w:lang w:val="es-PY"/>
         </w:rPr>
@@ -2072,6 +2073,7 @@
     </w:p>
     <w:p>
       <w:pPr>
+        <w:spacing w:after="30"/>
         <w:rPr>
           <w:lang w:val="es-PY"/>
         </w:rPr>
@@ -2086,6 +2088,7 @@
     </w:p>
     <w:p>
       <w:pPr>
+        <w:spacing w:after="30"/>
         <w:rPr>
           <w:lang w:val="es-PY"/>
         </w:rPr>
@@ -2100,6 +2103,8 @@
     </w:p>
     <w:p>
       <w:pPr>
+        <w:keepNext/>
+        <w:spacing w:after="30"/>
         <w:rPr>
           <w:lang w:val="es-PY"/>
         </w:rPr>
@@ -2115,6 +2120,7 @@
     </w:p>
     <w:p>
       <w:pPr>
+        <w:spacing w:after="30"/>
         <w:rPr>
           <w:lang w:val="es-PY"/>
         </w:rPr>
@@ -2129,6 +2135,7 @@
     </w:p>
     <w:p>
       <w:pPr>
+        <w:spacing w:after="30"/>
         <w:rPr>
           <w:lang w:val="es-PY"/>
         </w:rPr>
@@ -2143,6 +2150,7 @@
     </w:p>
     <w:p>
       <w:pPr>
+        <w:spacing w:after="30"/>
         <w:rPr>
           <w:lang w:val="es-PY"/>
         </w:rPr>
@@ -2157,6 +2165,8 @@
     </w:p>
     <w:p>
       <w:pPr>
+        <w:keepNext/>
+        <w:spacing w:after="30"/>
         <w:rPr>
           <w:lang w:val="es-PY"/>
         </w:rPr>
@@ -2200,6 +2210,7 @@
     </w:p>
     <w:p>
       <w:pPr>
+        <w:spacing w:after="30"/>
         <w:rPr>
           <w:lang w:val="es-PY"/>
         </w:rPr>
@@ -2214,6 +2225,7 @@
     </w:p>
     <w:p>
       <w:pPr>
+        <w:spacing w:after="30"/>
         <w:rPr>
           <w:lang w:val="es-PY"/>
         </w:rPr>
@@ -2230,6 +2242,7 @@
     <w:p>
       <w:pPr>
         <w:pStyle w:val="Ttulo3"/>
+        <w:spacing w:after="30"/>
         <w:rPr>
           <w:lang w:val="es-PY"/>
         </w:rPr>
@@ -2243,6 +2256,7 @@
     </w:p>
     <w:p>
       <w:pPr>
+        <w:spacing w:after="30"/>
         <w:rPr>
           <w:lang w:val="es-PY"/>
         </w:rPr>
@@ -2258,6 +2272,7 @@
     </w:p>
     <w:p>
       <w:pPr>
+        <w:spacing w:after="30"/>
         <w:rPr>
           <w:lang w:val="es-PY"/>
         </w:rPr>
@@ -2272,6 +2287,7 @@
     </w:p>
     <w:p>
       <w:pPr>
+        <w:spacing w:after="30"/>
         <w:rPr>
           <w:lang w:val="es-PY"/>
         </w:rPr>
@@ -2286,6 +2302,7 @@
     </w:p>
     <w:p>
       <w:pPr>
+        <w:spacing w:after="30"/>
         <w:rPr>
           <w:lang w:val="es-PY"/>
         </w:rPr>
@@ -2296,6 +2313,7 @@
     </w:p>
     <w:p>
       <w:pPr>
+        <w:spacing w:after="30"/>
         <w:rPr>
           <w:lang w:val="es-PY"/>
         </w:rPr>
@@ -2306,6 +2324,7 @@
     </w:p>
     <w:p>
       <w:pPr>
+        <w:spacing w:after="30"/>
         <w:rPr>
           <w:lang w:val="es-PY"/>
         </w:rPr>
@@ -2321,6 +2340,7 @@
     </w:p>
     <w:p>
       <w:pPr>
+        <w:spacing w:after="30"/>
         <w:rPr>
           <w:lang w:val="es-PY"/>
         </w:rPr>
@@ -2335,6 +2355,7 @@
     </w:p>
     <w:p>
       <w:pPr>
+        <w:spacing w:after="30"/>
         <w:rPr>
           <w:lang w:val="es-PY"/>
         </w:rPr>
@@ -2345,6 +2366,7 @@
     </w:p>
     <w:p>
       <w:pPr>
+        <w:spacing w:after="30"/>
         <w:rPr>
           <w:lang w:val="es-PY"/>
         </w:rPr>
@@ -2375,6 +2397,8 @@
     </w:p>
     <w:p>
       <w:pPr>
+        <w:keepNext/>
+        <w:spacing w:after="30"/>
         <w:rPr>
           <w:lang w:val="es-PY"/>
         </w:rPr>
@@ -2390,6 +2414,7 @@
     </w:p>
     <w:p>
       <w:pPr>
+        <w:spacing w:after="30"/>
         <w:rPr>
           <w:lang w:val="es-PY"/>
         </w:rPr>
@@ -2404,6 +2429,7 @@
     </w:p>
     <w:p>
       <w:pPr>
+        <w:spacing w:after="30"/>
         <w:rPr>
           <w:lang w:val="es-PY"/>
         </w:rPr>
@@ -2418,6 +2444,7 @@
     </w:p>
     <w:p>
       <w:pPr>
+        <w:spacing w:after="30"/>
         <w:rPr>
           <w:lang w:val="es-PY"/>
         </w:rPr>
@@ -2428,6 +2455,8 @@
     </w:p>
     <w:p>
       <w:pPr>
+        <w:keepNext/>
+        <w:spacing w:after="30"/>
         <w:rPr>
           <w:lang w:val="es-PY"/>
         </w:rPr>
@@ -2471,6 +2500,7 @@
     </w:p>
     <w:p>
       <w:pPr>
+        <w:spacing w:after="30"/>
         <w:rPr>
           <w:lang w:val="es-PY"/>
         </w:rPr>
@@ -2481,6 +2511,7 @@
     </w:p>
     <w:p>
       <w:pPr>
+        <w:spacing w:after="30"/>
         <w:rPr>
           <w:lang w:val="es-PY"/>
         </w:rPr>
@@ -2492,6 +2523,7 @@
     <w:p>
       <w:pPr>
         <w:pStyle w:val="Ttulo3"/>
+        <w:spacing w:after="30"/>
         <w:rPr>
           <w:lang w:val="es-PY"/>
         </w:rPr>
@@ -2505,6 +2537,7 @@
     </w:p>
     <w:p>
       <w:pPr>
+        <w:spacing w:after="30"/>
         <w:rPr>
           <w:lang w:val="es-PY"/>
         </w:rPr>
@@ -2520,6 +2553,7 @@
     </w:p>
     <w:p>
       <w:pPr>
+        <w:spacing w:after="30"/>
         <w:rPr>
           <w:lang w:val="es-PY"/>
         </w:rPr>
@@ -2534,6 +2568,7 @@
     </w:p>
     <w:p>
       <w:pPr>
+        <w:spacing w:after="30"/>
         <w:rPr>
           <w:lang w:val="es-PY"/>
         </w:rPr>
@@ -2548,6 +2583,7 @@
     </w:p>
     <w:p>
       <w:pPr>
+        <w:spacing w:after="30"/>
         <w:rPr>
           <w:lang w:val="es-PY"/>
         </w:rPr>
@@ -2562,6 +2598,7 @@
     </w:p>
     <w:p>
       <w:pPr>
+        <w:spacing w:after="30"/>
         <w:rPr>
           <w:lang w:val="es-PY"/>
         </w:rPr>
@@ -2592,6 +2629,7 @@
     </w:p>
     <w:p>
       <w:pPr>
+        <w:spacing w:after="30"/>
         <w:rPr>
           <w:lang w:val="es-PY"/>
         </w:rPr>
@@ -2607,6 +2645,7 @@
     </w:p>
     <w:p>
       <w:pPr>
+        <w:spacing w:after="30"/>
         <w:rPr>
           <w:lang w:val="es-PY"/>
         </w:rPr>
@@ -2621,6 +2660,7 @@
     </w:p>
     <w:p>
       <w:pPr>
+        <w:spacing w:after="30"/>
         <w:rPr>
           <w:lang w:val="es-PY"/>
         </w:rPr>
@@ -2635,6 +2675,7 @@
     </w:p>
     <w:p>
       <w:pPr>
+        <w:spacing w:after="30"/>
         <w:rPr>
           <w:lang w:val="es-PY"/>
         </w:rPr>
@@ -2649,6 +2690,8 @@
     </w:p>
     <w:p>
       <w:pPr>
+        <w:keepNext/>
+        <w:spacing w:after="30"/>
         <w:rPr>
           <w:lang w:val="es-PY"/>
         </w:rPr>
@@ -2664,6 +2707,7 @@
     </w:p>
     <w:p>
       <w:pPr>
+        <w:spacing w:after="30"/>
         <w:rPr>
           <w:lang w:val="es-PY"/>
         </w:rPr>
@@ -2678,6 +2722,7 @@
     </w:p>
     <w:p>
       <w:pPr>
+        <w:spacing w:after="30"/>
         <w:rPr>
           <w:lang w:val="es-PY"/>
         </w:rPr>
@@ -2692,6 +2737,7 @@
     </w:p>
     <w:p>
       <w:pPr>
+        <w:spacing w:after="30"/>
         <w:rPr>
           <w:lang w:val="es-PY"/>
         </w:rPr>
@@ -2706,6 +2752,8 @@
     </w:p>
     <w:p>
       <w:pPr>
+        <w:keepNext/>
+        <w:spacing w:after="30"/>
         <w:rPr>
           <w:lang w:val="es-PY"/>
         </w:rPr>
@@ -2749,6 +2797,7 @@
     </w:p>
     <w:p>
       <w:pPr>
+        <w:spacing w:after="30"/>
         <w:rPr>
           <w:lang w:val="es-PY"/>
         </w:rPr>
@@ -2763,6 +2812,7 @@
     </w:p>
     <w:p>
       <w:pPr>
+        <w:spacing w:after="30"/>
         <w:rPr>
           <w:lang w:val="es-PY"/>
         </w:rPr>
@@ -2778,6 +2828,7 @@
     <w:p>
       <w:pPr>
         <w:pStyle w:val="Ttulo3"/>
+        <w:spacing w:after="30"/>
         <w:rPr>
           <w:lang w:val="es-PY"/>
         </w:rPr>
@@ -2792,6 +2843,7 @@
     </w:p>
     <w:p>
       <w:pPr>
+        <w:spacing w:after="30"/>
         <w:rPr>
           <w:lang w:val="es-PY"/>
         </w:rPr>
@@ -2807,6 +2859,7 @@
     </w:p>
     <w:p>
       <w:pPr>
+        <w:spacing w:after="30"/>
         <w:rPr>
           <w:lang w:val="es-PY"/>
         </w:rPr>
@@ -2821,6 +2874,7 @@
     </w:p>
     <w:p>
       <w:pPr>
+        <w:spacing w:after="30"/>
         <w:rPr>
           <w:lang w:val="es-PY"/>
         </w:rPr>
@@ -2835,6 +2889,7 @@
     </w:p>
     <w:p>
       <w:pPr>
+        <w:spacing w:after="30"/>
         <w:rPr>
           <w:lang w:val="es-PY"/>
         </w:rPr>
@@ -2849,6 +2904,7 @@
     </w:p>
     <w:p>
       <w:pPr>
+        <w:spacing w:after="30"/>
         <w:rPr>
           <w:lang w:val="es-PY"/>
         </w:rPr>
@@ -2863,6 +2919,7 @@
     </w:p>
     <w:p>
       <w:pPr>
+        <w:spacing w:after="30"/>
         <w:rPr>
           <w:lang w:val="es-PY"/>
         </w:rPr>
@@ -2878,6 +2935,7 @@
     </w:p>
     <w:p>
       <w:pPr>
+        <w:spacing w:after="30"/>
         <w:rPr>
           <w:lang w:val="es-PY"/>
         </w:rPr>
@@ -2892,6 +2950,7 @@
     </w:p>
     <w:p>
       <w:pPr>
+        <w:spacing w:after="30"/>
         <w:rPr>
           <w:lang w:val="es-PY"/>
         </w:rPr>
@@ -2906,6 +2965,7 @@
     </w:p>
     <w:p>
       <w:pPr>
+        <w:spacing w:after="30"/>
         <w:rPr>
           <w:lang w:val="es-PY"/>
         </w:rPr>
@@ -2920,6 +2980,8 @@
     </w:p>
     <w:p>
       <w:pPr>
+        <w:keepNext/>
+        <w:spacing w:after="30"/>
         <w:rPr>
           <w:lang w:val="es-PY"/>
         </w:rPr>
@@ -2935,6 +2997,7 @@
     </w:p>
     <w:p>
       <w:pPr>
+        <w:spacing w:after="30"/>
         <w:rPr>
           <w:lang w:val="es-PY"/>
         </w:rPr>
@@ -2965,6 +3028,7 @@
     </w:p>
     <w:p>
       <w:pPr>
+        <w:spacing w:after="30"/>
         <w:rPr>
           <w:lang w:val="es-PY"/>
         </w:rPr>
@@ -2979,6 +3043,7 @@
     </w:p>
     <w:p>
       <w:pPr>
+        <w:spacing w:after="30"/>
         <w:rPr>
           <w:lang w:val="es-PY"/>
         </w:rPr>
@@ -2993,6 +3058,8 @@
     </w:p>
     <w:p>
       <w:pPr>
+        <w:keepNext/>
+        <w:spacing w:after="30"/>
         <w:rPr>
           <w:lang w:val="es-PY"/>
         </w:rPr>
@@ -3036,6 +3103,7 @@
     </w:p>
     <w:p>
       <w:pPr>
+        <w:spacing w:after="30"/>
         <w:rPr>
           <w:lang w:val="es-PY"/>
         </w:rPr>
@@ -3066,6 +3134,7 @@
     </w:p>
     <w:p>
       <w:pPr>
+        <w:spacing w:after="30"/>
         <w:rPr>
           <w:lang w:val="es-PY"/>
         </w:rPr>
@@ -3081,6 +3150,7 @@
     <w:p>
       <w:pPr>
         <w:pStyle w:val="Ttulo3"/>
+        <w:spacing w:after="30"/>
         <w:rPr>
           <w:lang w:val="es-PY"/>
         </w:rPr>
@@ -3094,6 +3164,7 @@
     </w:p>
     <w:p>
       <w:pPr>
+        <w:spacing w:after="30"/>
         <w:rPr>
           <w:lang w:val="es-PY"/>
         </w:rPr>
@@ -3109,6 +3180,7 @@
     </w:p>
     <w:p>
       <w:pPr>
+        <w:spacing w:after="30"/>
         <w:rPr>
           <w:lang w:val="es-PY"/>
         </w:rPr>
@@ -3123,6 +3195,7 @@
     </w:p>
     <w:p>
       <w:pPr>
+        <w:spacing w:after="30"/>
         <w:rPr>
           <w:lang w:val="es-PY"/>
         </w:rPr>
@@ -3137,6 +3210,7 @@
     </w:p>
     <w:p>
       <w:pPr>
+        <w:spacing w:after="30"/>
         <w:rPr>
           <w:lang w:val="es-PY"/>
         </w:rPr>
@@ -3151,6 +3225,7 @@
     </w:p>
     <w:p>
       <w:pPr>
+        <w:spacing w:after="30"/>
         <w:rPr>
           <w:lang w:val="es-PY"/>
         </w:rPr>
@@ -3165,6 +3240,7 @@
     </w:p>
     <w:p>
       <w:pPr>
+        <w:spacing w:after="30"/>
         <w:rPr>
           <w:lang w:val="es-PY"/>
         </w:rPr>
@@ -3180,6 +3256,7 @@
     </w:p>
     <w:p>
       <w:pPr>
+        <w:spacing w:after="30"/>
         <w:rPr>
           <w:lang w:val="es-PY"/>
         </w:rPr>
@@ -3194,6 +3271,7 @@
     </w:p>
     <w:p>
       <w:pPr>
+        <w:spacing w:after="30"/>
         <w:rPr>
           <w:lang w:val="es-PY"/>
         </w:rPr>
@@ -3208,6 +3286,7 @@
     </w:p>
     <w:p>
       <w:pPr>
+        <w:spacing w:after="30"/>
         <w:rPr>
           <w:lang w:val="es-PY"/>
         </w:rPr>
@@ -3222,6 +3301,8 @@
     </w:p>
     <w:p>
       <w:pPr>
+        <w:keepNext/>
+        <w:spacing w:after="30"/>
         <w:rPr>
           <w:lang w:val="es-PY"/>
         </w:rPr>
@@ -3237,6 +3318,7 @@
     </w:p>
     <w:p>
       <w:pPr>
+        <w:spacing w:after="30"/>
         <w:rPr>
           <w:lang w:val="es-PY"/>
         </w:rPr>
@@ -3251,6 +3333,7 @@
     </w:p>
     <w:p>
       <w:pPr>
+        <w:spacing w:after="30"/>
         <w:rPr>
           <w:lang w:val="es-PY"/>
         </w:rPr>
@@ -3265,6 +3348,7 @@
     </w:p>
     <w:p>
       <w:pPr>
+        <w:spacing w:after="30"/>
         <w:rPr>
           <w:lang w:val="es-PY"/>
         </w:rPr>
@@ -3279,6 +3363,8 @@
     </w:p>
     <w:p>
       <w:pPr>
+        <w:keepNext/>
+        <w:spacing w:after="30"/>
         <w:rPr>
           <w:lang w:val="es-PY"/>
         </w:rPr>
@@ -3322,6 +3408,7 @@
     </w:p>
     <w:p>
       <w:pPr>
+        <w:spacing w:after="30"/>
         <w:rPr>
           <w:lang w:val="es-PY"/>
         </w:rPr>
@@ -3336,6 +3423,7 @@
     </w:p>
     <w:p>
       <w:pPr>
+        <w:spacing w:after="30"/>
         <w:rPr>
           <w:lang w:val="es-PY"/>
         </w:rPr>
@@ -3351,6 +3439,7 @@
     <w:p>
       <w:pPr>
         <w:pStyle w:val="Ttulo3"/>
+        <w:spacing w:after="30"/>
         <w:rPr>
           <w:lang w:val="es-PY"/>
         </w:rPr>
@@ -3364,6 +3453,7 @@
     </w:p>
     <w:p>
       <w:pPr>
+        <w:spacing w:after="30"/>
         <w:rPr>
           <w:lang w:val="es-PY"/>
         </w:rPr>
@@ -3379,6 +3469,7 @@
     </w:p>
     <w:p>
       <w:pPr>
+        <w:spacing w:after="30"/>
         <w:rPr>
           <w:lang w:val="es-PY"/>
         </w:rPr>
@@ -3393,6 +3484,7 @@
     </w:p>
     <w:p>
       <w:pPr>
+        <w:spacing w:after="30"/>
         <w:rPr>
           <w:lang w:val="es-PY"/>
         </w:rPr>
@@ -3407,6 +3499,7 @@
     </w:p>
     <w:p>
       <w:pPr>
+        <w:spacing w:after="30"/>
         <w:rPr>
           <w:lang w:val="es-PY"/>
         </w:rPr>
@@ -3438,6 +3531,7 @@
     </w:p>
     <w:p>
       <w:pPr>
+        <w:spacing w:after="30"/>
         <w:rPr>
           <w:lang w:val="es-PY"/>
         </w:rPr>
@@ -3452,6 +3546,7 @@
     </w:p>
     <w:p>
       <w:pPr>
+        <w:spacing w:after="30"/>
         <w:rPr>
           <w:lang w:val="es-PY"/>
         </w:rPr>
@@ -3467,6 +3562,7 @@
     </w:p>
     <w:p>
       <w:pPr>
+        <w:spacing w:after="30"/>
         <w:rPr>
           <w:lang w:val="es-PY"/>
         </w:rPr>
@@ -3481,6 +3577,7 @@
     </w:p>
     <w:p>
       <w:pPr>
+        <w:spacing w:after="30"/>
         <w:rPr>
           <w:lang w:val="es-PY"/>
         </w:rPr>
@@ -3495,6 +3592,7 @@
     </w:p>
     <w:p>
       <w:pPr>
+        <w:spacing w:after="30"/>
         <w:rPr>
           <w:lang w:val="es-PY"/>
         </w:rPr>
@@ -3509,6 +3607,8 @@
     </w:p>
     <w:p>
       <w:pPr>
+        <w:keepNext/>
+        <w:spacing w:after="30"/>
         <w:rPr>
           <w:lang w:val="es-PY"/>
         </w:rPr>
@@ -3524,6 +3624,7 @@
     </w:p>
     <w:p>
       <w:pPr>
+        <w:spacing w:after="30"/>
         <w:rPr>
           <w:lang w:val="es-PY"/>
         </w:rPr>
@@ -3538,6 +3639,7 @@
     </w:p>
     <w:p>
       <w:pPr>
+        <w:spacing w:after="30"/>
         <w:rPr>
           <w:lang w:val="es-PY"/>
         </w:rPr>
@@ -3552,6 +3654,7 @@
     </w:p>
     <w:p>
       <w:pPr>
+        <w:spacing w:after="30"/>
         <w:rPr>
           <w:lang w:val="es-PY"/>
         </w:rPr>
@@ -3566,6 +3669,8 @@
     </w:p>
     <w:p>
       <w:pPr>
+        <w:keepNext/>
+        <w:spacing w:after="30"/>
         <w:rPr>
           <w:lang w:val="es-PY"/>
         </w:rPr>
@@ -3609,6 +3714,7 @@
     </w:p>
     <w:p>
       <w:pPr>
+        <w:spacing w:after="30"/>
         <w:rPr>
           <w:lang w:val="es-PY"/>
         </w:rPr>
@@ -3623,6 +3729,7 @@
     </w:p>
     <w:p>
       <w:pPr>
+        <w:spacing w:after="30"/>
         <w:rPr>
           <w:lang w:val="es-PY"/>
         </w:rPr>
@@ -3654,6 +3761,7 @@
     <w:p>
       <w:pPr>
         <w:pStyle w:val="Ttulo3"/>
+        <w:spacing w:after="30"/>
         <w:rPr>
           <w:lang w:val="es-PY"/>
         </w:rPr>
@@ -3667,6 +3775,7 @@
     </w:p>
     <w:p>
       <w:pPr>
+        <w:spacing w:after="30"/>
         <w:rPr>
           <w:lang w:val="es-PY"/>
         </w:rPr>
@@ -3682,6 +3791,7 @@
     </w:p>
     <w:p>
       <w:pPr>
+        <w:spacing w:after="30"/>
         <w:rPr>
           <w:lang w:val="es-PY"/>
         </w:rPr>
@@ -3696,6 +3806,7 @@
     </w:p>
     <w:p>
       <w:pPr>
+        <w:spacing w:after="30"/>
         <w:rPr>
           <w:lang w:val="es-PY"/>
         </w:rPr>
@@ -3710,6 +3821,7 @@
     </w:p>
     <w:p>
       <w:pPr>
+        <w:spacing w:after="30"/>
         <w:rPr>
           <w:lang w:val="es-PY"/>
         </w:rPr>
@@ -3724,6 +3836,7 @@
     </w:p>
     <w:p>
       <w:pPr>
+        <w:spacing w:after="30"/>
         <w:rPr>
           <w:lang w:val="es-PY"/>
         </w:rPr>
@@ -3738,6 +3851,7 @@
     </w:p>
     <w:p>
       <w:pPr>
+        <w:spacing w:after="30"/>
         <w:rPr>
           <w:lang w:val="es-PY"/>
         </w:rPr>
@@ -3753,6 +3867,7 @@
     </w:p>
     <w:p>
       <w:pPr>
+        <w:spacing w:after="30"/>
         <w:rPr>
           <w:lang w:val="es-PY"/>
         </w:rPr>
@@ -3767,6 +3882,7 @@
     </w:p>
     <w:p>
       <w:pPr>
+        <w:spacing w:after="30"/>
         <w:rPr>
           <w:lang w:val="es-PY"/>
         </w:rPr>
@@ -3781,6 +3897,7 @@
     </w:p>
     <w:p>
       <w:pPr>
+        <w:spacing w:after="30"/>
         <w:rPr>
           <w:lang w:val="es-PY"/>
         </w:rPr>
@@ -3795,6 +3912,8 @@
     </w:p>
     <w:p>
       <w:pPr>
+        <w:keepNext/>
+        <w:spacing w:after="30"/>
         <w:rPr>
           <w:lang w:val="es-PY"/>
         </w:rPr>
@@ -3810,6 +3929,7 @@
     </w:p>
     <w:p>
       <w:pPr>
+        <w:spacing w:after="30"/>
         <w:rPr>
           <w:lang w:val="es-PY"/>
         </w:rPr>
@@ -3824,6 +3944,7 @@
     </w:p>
     <w:p>
       <w:pPr>
+        <w:spacing w:after="30"/>
         <w:rPr>
           <w:lang w:val="es-PY"/>
         </w:rPr>
@@ -3838,6 +3959,7 @@
     </w:p>
     <w:p>
       <w:pPr>
+        <w:spacing w:after="30"/>
         <w:rPr>
           <w:lang w:val="es-PY"/>
         </w:rPr>
@@ -3852,6 +3974,8 @@
     </w:p>
     <w:p>
       <w:pPr>
+        <w:keepNext/>
+        <w:spacing w:after="30"/>
         <w:rPr>
           <w:lang w:val="es-PY"/>
         </w:rPr>
@@ -3895,6 +4019,7 @@
     </w:p>
     <w:p>
       <w:pPr>
+        <w:spacing w:after="30"/>
         <w:rPr>
           <w:lang w:val="es-PY"/>
         </w:rPr>
@@ -3909,6 +4034,7 @@
     </w:p>
     <w:p>
       <w:pPr>
+        <w:spacing w:after="30"/>
         <w:rPr>
           <w:lang w:val="es-PY"/>
         </w:rPr>
@@ -3924,6 +4050,7 @@
     <w:p>
       <w:pPr>
         <w:pStyle w:val="Ttulo3"/>
+        <w:spacing w:after="30"/>
         <w:rPr>
           <w:lang w:val="es-PY"/>
         </w:rPr>
@@ -3937,6 +4064,7 @@
     </w:p>
     <w:p>
       <w:pPr>
+        <w:spacing w:after="30"/>
         <w:rPr>
           <w:lang w:val="es-PY"/>
         </w:rPr>
@@ -3952,6 +4080,7 @@
     </w:p>
     <w:p>
       <w:pPr>
+        <w:spacing w:after="30"/>
         <w:rPr>
           <w:lang w:val="es-PY"/>
         </w:rPr>
@@ -3966,6 +4095,7 @@
     </w:p>
     <w:p>
       <w:pPr>
+        <w:spacing w:after="30"/>
         <w:rPr>
           <w:lang w:val="es-PY"/>
         </w:rPr>
@@ -3980,6 +4110,7 @@
     </w:p>
     <w:p>
       <w:pPr>
+        <w:spacing w:after="30"/>
         <w:rPr>
           <w:lang w:val="es-PY"/>
         </w:rPr>
@@ -3994,6 +4125,7 @@
     </w:p>
     <w:p>
       <w:pPr>
+        <w:spacing w:after="30"/>
         <w:rPr>
           <w:lang w:val="es-PY"/>
         </w:rPr>
@@ -4008,6 +4140,7 @@
     </w:p>
     <w:p>
       <w:pPr>
+        <w:spacing w:after="30"/>
         <w:rPr>
           <w:lang w:val="es-PY"/>
         </w:rPr>
@@ -4023,6 +4156,7 @@
     </w:p>
     <w:p>
       <w:pPr>
+        <w:spacing w:after="30"/>
         <w:rPr>
           <w:lang w:val="es-PY"/>
         </w:rPr>
@@ -4038,6 +4172,7 @@
     </w:p>
     <w:p>
       <w:pPr>
+        <w:spacing w:after="30"/>
         <w:rPr>
           <w:lang w:val="es-PY"/>
         </w:rPr>
@@ -4052,6 +4187,7 @@
     </w:p>
     <w:p>
       <w:pPr>
+        <w:spacing w:after="30"/>
         <w:rPr>
           <w:lang w:val="es-PY"/>
         </w:rPr>
@@ -4066,6 +4202,8 @@
     </w:p>
     <w:p>
       <w:pPr>
+        <w:keepNext/>
+        <w:spacing w:after="30"/>
         <w:rPr>
           <w:lang w:val="es-PY"/>
         </w:rPr>
@@ -4081,6 +4219,7 @@
     </w:p>
     <w:p>
       <w:pPr>
+        <w:spacing w:after="30"/>
         <w:rPr>
           <w:lang w:val="es-PY"/>
         </w:rPr>
@@ -4095,6 +4234,7 @@
     </w:p>
     <w:p>
       <w:pPr>
+        <w:spacing w:after="30"/>
         <w:rPr>
           <w:lang w:val="es-PY"/>
         </w:rPr>
@@ -4109,6 +4249,7 @@
     </w:p>
     <w:p>
       <w:pPr>
+        <w:spacing w:after="30"/>
         <w:rPr>
           <w:lang w:val="es-PY"/>
         </w:rPr>
@@ -4123,6 +4264,8 @@
     </w:p>
     <w:p>
       <w:pPr>
+        <w:keepNext/>
+        <w:spacing w:after="30"/>
         <w:rPr>
           <w:lang w:val="es-PY"/>
         </w:rPr>
@@ -4166,6 +4309,7 @@
     </w:p>
     <w:p>
       <w:pPr>
+        <w:spacing w:after="30"/>
         <w:rPr>
           <w:lang w:val="es-PY"/>
         </w:rPr>
@@ -4180,6 +4324,7 @@
     </w:p>
     <w:p>
       <w:pPr>
+        <w:spacing w:after="30"/>
         <w:rPr>
           <w:lang w:val="es-PY"/>
         </w:rPr>
@@ -4195,6 +4340,7 @@
     <w:p>
       <w:pPr>
         <w:pStyle w:val="Ttulo2"/>
+        <w:spacing w:after="30"/>
         <w:rPr>
           <w:lang w:val="es-PY"/>
         </w:rPr>
@@ -4209,6 +4355,7 @@
     <w:p>
       <w:pPr>
         <w:pStyle w:val="Ttulo3"/>
+        <w:spacing w:after="30"/>
         <w:rPr>
           <w:lang w:val="es-PY"/>
         </w:rPr>
@@ -4222,6 +4369,7 @@
     </w:p>
     <w:p>
       <w:pPr>
+        <w:spacing w:after="30"/>
         <w:rPr>
           <w:lang w:val="es-PY"/>
         </w:rPr>
@@ -4237,6 +4385,7 @@
     </w:p>
     <w:p>
       <w:pPr>
+        <w:spacing w:after="30"/>
         <w:rPr>
           <w:lang w:val="es-PY"/>
         </w:rPr>
@@ -4251,6 +4400,7 @@
     </w:p>
     <w:p>
       <w:pPr>
+        <w:spacing w:after="30"/>
         <w:rPr>
           <w:lang w:val="es-PY"/>
         </w:rPr>
@@ -4281,6 +4431,7 @@
     </w:p>
     <w:p>
       <w:pPr>
+        <w:spacing w:after="30"/>
         <w:rPr>
           <w:lang w:val="es-PY"/>
         </w:rPr>
@@ -4295,6 +4446,7 @@
     </w:p>
     <w:p>
       <w:pPr>
+        <w:spacing w:after="30"/>
         <w:rPr>
           <w:lang w:val="es-PY"/>
         </w:rPr>
@@ -4325,6 +4477,7 @@
     </w:p>
     <w:p>
       <w:pPr>
+        <w:spacing w:after="30"/>
         <w:rPr>
           <w:lang w:val="es-PY"/>
         </w:rPr>
@@ -4340,6 +4493,7 @@
     </w:p>
     <w:p>
       <w:pPr>
+        <w:spacing w:after="30"/>
         <w:rPr>
           <w:lang w:val="es-PY"/>
         </w:rPr>
@@ -4354,6 +4508,7 @@
     </w:p>
     <w:p>
       <w:pPr>
+        <w:spacing w:after="30"/>
         <w:rPr>
           <w:lang w:val="es-PY"/>
         </w:rPr>
@@ -4368,6 +4523,7 @@
     </w:p>
     <w:p>
       <w:pPr>
+        <w:spacing w:after="30"/>
         <w:rPr>
           <w:lang w:val="es-PY"/>
         </w:rPr>
@@ -4382,6 +4538,8 @@
     </w:p>
     <w:p>
       <w:pPr>
+        <w:keepNext/>
+        <w:spacing w:after="30"/>
         <w:rPr>
           <w:lang w:val="es-PY"/>
         </w:rPr>
@@ -4397,6 +4555,7 @@
     </w:p>
     <w:p>
       <w:pPr>
+        <w:spacing w:after="30"/>
         <w:rPr>
           <w:lang w:val="es-PY"/>
         </w:rPr>
@@ -4411,6 +4570,7 @@
     </w:p>
     <w:p>
       <w:pPr>
+        <w:spacing w:after="30"/>
         <w:rPr>
           <w:lang w:val="es-PY"/>
         </w:rPr>
@@ -4425,6 +4585,7 @@
     </w:p>
     <w:p>
       <w:pPr>
+        <w:spacing w:after="30"/>
         <w:rPr>
           <w:lang w:val="es-PY"/>
         </w:rPr>
@@ -4439,6 +4600,8 @@
     </w:p>
     <w:p>
       <w:pPr>
+        <w:keepNext/>
+        <w:spacing w:after="30"/>
         <w:rPr>
           <w:lang w:val="es-PY"/>
         </w:rPr>
@@ -4482,6 +4645,7 @@
     </w:p>
     <w:p>
       <w:pPr>
+        <w:spacing w:after="30"/>
         <w:rPr>
           <w:lang w:val="es-PY"/>
         </w:rPr>
@@ -4528,6 +4692,7 @@
     </w:p>
     <w:p>
       <w:pPr>
+        <w:spacing w:after="30"/>
         <w:rPr>
           <w:lang w:val="es-PY"/>
         </w:rPr>
@@ -4559,6 +4724,7 @@
     <w:p>
       <w:pPr>
         <w:pStyle w:val="Ttulo3"/>
+        <w:spacing w:after="30"/>
         <w:rPr>
           <w:lang w:val="es-PY"/>
         </w:rPr>
@@ -4572,6 +4738,7 @@
     </w:p>
     <w:p>
       <w:pPr>
+        <w:spacing w:after="30"/>
         <w:rPr>
           <w:lang w:val="es-PY"/>
         </w:rPr>
@@ -4587,6 +4754,7 @@
     </w:p>
     <w:p>
       <w:pPr>
+        <w:spacing w:after="30"/>
         <w:rPr>
           <w:lang w:val="es-PY"/>
         </w:rPr>
@@ -4601,6 +4769,7 @@
     </w:p>
     <w:p>
       <w:pPr>
+        <w:spacing w:after="30"/>
         <w:rPr>
           <w:lang w:val="es-PY"/>
         </w:rPr>
@@ -4615,6 +4784,7 @@
     </w:p>
     <w:p>
       <w:pPr>
+        <w:spacing w:after="30"/>
         <w:rPr>
           <w:lang w:val="es-PY"/>
         </w:rPr>
@@ -4629,6 +4799,7 @@
     </w:p>
     <w:p>
       <w:pPr>
+        <w:spacing w:after="30"/>
         <w:rPr>
           <w:lang w:val="es-PY"/>
         </w:rPr>
@@ -4643,6 +4814,7 @@
     </w:p>
     <w:p>
       <w:pPr>
+        <w:spacing w:after="30"/>
         <w:rPr>
           <w:lang w:val="es-PY"/>
         </w:rPr>
@@ -4658,6 +4830,7 @@
     </w:p>
     <w:p>
       <w:pPr>
+        <w:spacing w:after="30"/>
         <w:rPr>
           <w:lang w:val="es-PY"/>
         </w:rPr>
@@ -4673,6 +4846,7 @@
     </w:p>
     <w:p>
       <w:pPr>
+        <w:spacing w:after="30"/>
         <w:rPr>
           <w:lang w:val="es-PY"/>
         </w:rPr>
@@ -4687,6 +4861,7 @@
     </w:p>
     <w:p>
       <w:pPr>
+        <w:spacing w:after="30"/>
         <w:rPr>
           <w:lang w:val="es-PY"/>
         </w:rPr>
@@ -4701,6 +4876,8 @@
     </w:p>
     <w:p>
       <w:pPr>
+        <w:keepNext/>
+        <w:spacing w:after="30"/>
         <w:rPr>
           <w:lang w:val="es-PY"/>
         </w:rPr>
@@ -4716,6 +4893,7 @@
     </w:p>
     <w:p>
       <w:pPr>
+        <w:spacing w:after="30"/>
         <w:rPr>
           <w:lang w:val="es-PY"/>
         </w:rPr>
@@ -4730,6 +4908,7 @@
     </w:p>
     <w:p>
       <w:pPr>
+        <w:spacing w:after="30"/>
         <w:rPr>
           <w:lang w:val="es-PY"/>
         </w:rPr>
@@ -4744,6 +4923,7 @@
     </w:p>
     <w:p>
       <w:pPr>
+        <w:spacing w:after="30"/>
         <w:rPr>
           <w:lang w:val="es-PY"/>
         </w:rPr>
@@ -4758,6 +4938,8 @@
     </w:p>
     <w:p>
       <w:pPr>
+        <w:keepNext/>
+        <w:spacing w:after="30"/>
         <w:rPr>
           <w:lang w:val="es-PY"/>
         </w:rPr>
@@ -4801,6 +4983,7 @@
     </w:p>
     <w:p>
       <w:pPr>
+        <w:spacing w:after="30"/>
         <w:rPr>
           <w:lang w:val="es-PY"/>
         </w:rPr>
@@ -4815,6 +4998,7 @@
     </w:p>
     <w:p>
       <w:pPr>
+        <w:spacing w:after="30"/>
         <w:rPr>
           <w:lang w:val="es-PY"/>
         </w:rPr>
@@ -4830,6 +5014,7 @@
     <w:p>
       <w:pPr>
         <w:pStyle w:val="Ttulo3"/>
+        <w:spacing w:after="30"/>
         <w:rPr>
           <w:lang w:val="es-PY"/>
         </w:rPr>
@@ -4843,6 +5028,7 @@
     </w:p>
     <w:p>
       <w:pPr>
+        <w:spacing w:after="30"/>
         <w:rPr>
           <w:lang w:val="es-PY"/>
         </w:rPr>
@@ -4858,6 +5044,7 @@
     </w:p>
     <w:p>
       <w:pPr>
+        <w:spacing w:after="30"/>
         <w:rPr>
           <w:lang w:val="es-PY"/>
         </w:rPr>
@@ -4872,6 +5059,7 @@
     </w:p>
     <w:p>
       <w:pPr>
+        <w:spacing w:after="30"/>
         <w:rPr>
           <w:lang w:val="es-PY"/>
         </w:rPr>
@@ -4886,6 +5074,7 @@
     </w:p>
     <w:p>
       <w:pPr>
+        <w:spacing w:after="30"/>
         <w:rPr>
           <w:lang w:val="es-PY"/>
         </w:rPr>
@@ -4900,6 +5089,7 @@
     </w:p>
     <w:p>
       <w:pPr>
+        <w:spacing w:after="30"/>
         <w:rPr>
           <w:lang w:val="es-PY"/>
         </w:rPr>
@@ -4914,6 +5104,7 @@
     </w:p>
     <w:p>
       <w:pPr>
+        <w:spacing w:after="30"/>
         <w:rPr>
           <w:lang w:val="es-PY"/>
         </w:rPr>
@@ -4929,6 +5120,7 @@
     </w:p>
     <w:p>
       <w:pPr>
+        <w:spacing w:after="30"/>
         <w:rPr>
           <w:lang w:val="es-PY"/>
         </w:rPr>
@@ -4959,6 +5151,7 @@
     </w:p>
     <w:p>
       <w:pPr>
+        <w:spacing w:after="30"/>
         <w:rPr>
           <w:lang w:val="es-PY"/>
         </w:rPr>
@@ -4973,6 +5166,7 @@
     </w:p>
     <w:p>
       <w:pPr>
+        <w:spacing w:after="30"/>
         <w:rPr>
           <w:lang w:val="es-PY"/>
         </w:rPr>
@@ -4987,6 +5181,8 @@
     </w:p>
     <w:p>
       <w:pPr>
+        <w:keepNext/>
+        <w:spacing w:after="30"/>
         <w:rPr>
           <w:lang w:val="es-PY"/>
         </w:rPr>
@@ -5002,6 +5198,7 @@
     </w:p>
     <w:p>
       <w:pPr>
+        <w:spacing w:after="30"/>
         <w:rPr>
           <w:lang w:val="es-PY"/>
         </w:rPr>
@@ -5016,6 +5213,7 @@
     </w:p>
     <w:p>
       <w:pPr>
+        <w:spacing w:after="30"/>
         <w:rPr>
           <w:lang w:val="es-PY"/>
         </w:rPr>
@@ -5030,6 +5228,7 @@
     </w:p>
     <w:p>
       <w:pPr>
+        <w:spacing w:after="30"/>
         <w:rPr>
           <w:lang w:val="es-PY"/>
         </w:rPr>
@@ -5044,6 +5243,8 @@
     </w:p>
     <w:p>
       <w:pPr>
+        <w:keepNext/>
+        <w:spacing w:after="30"/>
         <w:rPr>
           <w:lang w:val="es-PY"/>
         </w:rPr>
@@ -5087,6 +5288,7 @@
     </w:p>
     <w:p>
       <w:pPr>
+        <w:spacing w:after="30"/>
         <w:rPr>
           <w:lang w:val="es-PY"/>
         </w:rPr>
@@ -5101,6 +5303,7 @@
     </w:p>
     <w:p>
       <w:pPr>
+        <w:spacing w:after="30"/>
         <w:rPr>
           <w:lang w:val="es-PY"/>
         </w:rPr>
@@ -5116,6 +5319,7 @@
     <w:p>
       <w:pPr>
         <w:pStyle w:val="Ttulo3"/>
+        <w:spacing w:after="30"/>
         <w:rPr>
           <w:lang w:val="es-PY"/>
         </w:rPr>
@@ -5129,6 +5333,7 @@
     </w:p>
     <w:p>
       <w:pPr>
+        <w:spacing w:after="30"/>
         <w:rPr>
           <w:lang w:val="es-PY"/>
         </w:rPr>
@@ -5144,6 +5349,7 @@
     </w:p>
     <w:p>
       <w:pPr>
+        <w:spacing w:after="30"/>
         <w:rPr>
           <w:lang w:val="es-PY"/>
         </w:rPr>
@@ -5158,6 +5364,7 @@
     </w:p>
     <w:p>
       <w:pPr>
+        <w:spacing w:after="30"/>
         <w:rPr>
           <w:lang w:val="es-PY"/>
         </w:rPr>
@@ -5172,6 +5379,7 @@
     </w:p>
     <w:p>
       <w:pPr>
+        <w:spacing w:after="30"/>
         <w:rPr>
           <w:lang w:val="es-PY"/>
         </w:rPr>
@@ -5186,6 +5394,7 @@
     </w:p>
     <w:p>
       <w:pPr>
+        <w:spacing w:after="30"/>
         <w:rPr>
           <w:lang w:val="es-PY"/>
         </w:rPr>
@@ -5200,6 +5409,7 @@
     </w:p>
     <w:p>
       <w:pPr>
+        <w:spacing w:after="30"/>
         <w:rPr>
           <w:lang w:val="es-PY"/>
         </w:rPr>
@@ -5215,6 +5425,7 @@
     </w:p>
     <w:p>
       <w:pPr>
+        <w:spacing w:after="30"/>
         <w:rPr>
           <w:lang w:val="es-PY"/>
         </w:rPr>
@@ -5229,6 +5440,7 @@
     </w:p>
     <w:p>
       <w:pPr>
+        <w:spacing w:after="30"/>
         <w:rPr>
           <w:lang w:val="es-PY"/>
         </w:rPr>
@@ -5243,6 +5455,7 @@
     </w:p>
     <w:p>
       <w:pPr>
+        <w:spacing w:after="30"/>
         <w:rPr>
           <w:lang w:val="es-PY"/>
         </w:rPr>
@@ -5258,6 +5471,8 @@
     </w:p>
     <w:p>
       <w:pPr>
+        <w:keepNext/>
+        <w:spacing w:after="30"/>
         <w:rPr>
           <w:lang w:val="es-PY"/>
         </w:rPr>
@@ -5273,6 +5488,7 @@
     </w:p>
     <w:p>
       <w:pPr>
+        <w:spacing w:after="30"/>
         <w:rPr>
           <w:lang w:val="es-PY"/>
         </w:rPr>
@@ -5287,6 +5503,7 @@
     </w:p>
     <w:p>
       <w:pPr>
+        <w:spacing w:after="30"/>
         <w:rPr>
           <w:lang w:val="es-PY"/>
         </w:rPr>
@@ -5301,6 +5518,7 @@
     </w:p>
     <w:p>
       <w:pPr>
+        <w:spacing w:after="30"/>
         <w:rPr>
           <w:lang w:val="es-PY"/>
         </w:rPr>
@@ -5315,6 +5533,8 @@
     </w:p>
     <w:p>
       <w:pPr>
+        <w:keepNext/>
+        <w:spacing w:after="30"/>
         <w:rPr>
           <w:lang w:val="es-PY"/>
         </w:rPr>
@@ -5358,6 +5578,7 @@
     </w:p>
     <w:p>
       <w:pPr>
+        <w:spacing w:after="30"/>
         <w:rPr>
           <w:lang w:val="es-PY"/>
         </w:rPr>
@@ -5468,6 +5689,7 @@
     </w:p>
     <w:p>
       <w:pPr>
+        <w:spacing w:after="30"/>
         <w:rPr>
           <w:lang w:val="es-PY"/>
         </w:rPr>
@@ -5483,6 +5705,7 @@
     <w:p>
       <w:pPr>
         <w:pStyle w:val="Ttulo3"/>
+        <w:spacing w:after="30"/>
         <w:rPr>
           <w:lang w:val="es-PY"/>
         </w:rPr>
@@ -5496,6 +5719,7 @@
     </w:p>
     <w:p>
       <w:pPr>
+        <w:spacing w:after="30"/>
         <w:rPr>
           <w:lang w:val="es-PY"/>
         </w:rPr>
@@ -5511,6 +5735,7 @@
     </w:p>
     <w:p>
       <w:pPr>
+        <w:spacing w:after="30"/>
         <w:rPr>
           <w:lang w:val="es-PY"/>
         </w:rPr>
@@ -5525,6 +5750,7 @@
     </w:p>
     <w:p>
       <w:pPr>
+        <w:spacing w:after="30"/>
         <w:rPr>
           <w:lang w:val="es-PY"/>
         </w:rPr>
@@ -5539,6 +5765,7 @@
     </w:p>
     <w:p>
       <w:pPr>
+        <w:spacing w:after="30"/>
         <w:rPr>
           <w:lang w:val="es-PY"/>
         </w:rPr>
@@ -5553,6 +5780,7 @@
     </w:p>
     <w:p>
       <w:pPr>
+        <w:spacing w:after="30"/>
         <w:rPr>
           <w:lang w:val="es-PY"/>
         </w:rPr>
@@ -5567,6 +5795,7 @@
     </w:p>
     <w:p>
       <w:pPr>
+        <w:spacing w:after="30"/>
         <w:rPr>
           <w:lang w:val="es-PY"/>
         </w:rPr>
@@ -5582,6 +5811,7 @@
     </w:p>
     <w:p>
       <w:pPr>
+        <w:spacing w:after="30"/>
         <w:rPr>
           <w:lang w:val="es-PY"/>
         </w:rPr>
@@ -5596,6 +5826,7 @@
     </w:p>
     <w:p>
       <w:pPr>
+        <w:spacing w:after="30"/>
         <w:rPr>
           <w:lang w:val="es-PY"/>
         </w:rPr>
@@ -5610,6 +5841,7 @@
     </w:p>
     <w:p>
       <w:pPr>
+        <w:spacing w:after="30"/>
         <w:rPr>
           <w:lang w:val="es-PY"/>
         </w:rPr>
@@ -5624,6 +5856,8 @@
     </w:p>
     <w:p>
       <w:pPr>
+        <w:keepNext/>
+        <w:spacing w:after="30"/>
         <w:rPr>
           <w:lang w:val="es-PY"/>
         </w:rPr>
@@ -5639,6 +5873,7 @@
     </w:p>
     <w:p>
       <w:pPr>
+        <w:spacing w:after="30"/>
         <w:rPr>
           <w:lang w:val="es-PY"/>
         </w:rPr>
@@ -5653,6 +5888,7 @@
     </w:p>
     <w:p>
       <w:pPr>
+        <w:spacing w:after="30"/>
         <w:rPr>
           <w:lang w:val="es-PY"/>
         </w:rPr>
@@ -5667,6 +5903,7 @@
     </w:p>
     <w:p>
       <w:pPr>
+        <w:spacing w:after="30"/>
         <w:rPr>
           <w:lang w:val="es-PY"/>
         </w:rPr>
@@ -5681,6 +5918,8 @@
     </w:p>
     <w:p>
       <w:pPr>
+        <w:keepNext/>
+        <w:spacing w:after="30"/>
         <w:rPr>
           <w:lang w:val="es-PY"/>
         </w:rPr>
@@ -5724,6 +5963,7 @@
     </w:p>
     <w:p>
       <w:pPr>
+        <w:spacing w:after="30"/>
         <w:rPr>
           <w:lang w:val="es-PY"/>
         </w:rPr>
@@ -5738,6 +5978,7 @@
     </w:p>
     <w:p>
       <w:pPr>
+        <w:spacing w:after="30"/>
         <w:rPr>
           <w:lang w:val="es-PY"/>
         </w:rPr>
@@ -5753,6 +5994,7 @@
     <w:p>
       <w:pPr>
         <w:pStyle w:val="Ttulo3"/>
+        <w:spacing w:after="30"/>
         <w:rPr>
           <w:lang w:val="es-PY"/>
         </w:rPr>
@@ -5766,6 +6008,7 @@
     </w:p>
     <w:p>
       <w:pPr>
+        <w:spacing w:after="30"/>
         <w:rPr>
           <w:lang w:val="es-PY"/>
         </w:rPr>
@@ -5781,6 +6024,7 @@
     </w:p>
     <w:p>
       <w:pPr>
+        <w:spacing w:after="30"/>
         <w:rPr>
           <w:lang w:val="es-PY"/>
         </w:rPr>
@@ -5795,6 +6039,7 @@
     </w:p>
     <w:p>
       <w:pPr>
+        <w:spacing w:after="30"/>
         <w:rPr>
           <w:lang w:val="es-PY"/>
         </w:rPr>
@@ -5809,6 +6054,7 @@
     </w:p>
     <w:p>
       <w:pPr>
+        <w:spacing w:after="30"/>
         <w:rPr>
           <w:lang w:val="es-PY"/>
         </w:rPr>
@@ -5823,6 +6069,7 @@
     </w:p>
     <w:p>
       <w:pPr>
+        <w:spacing w:after="30"/>
         <w:rPr>
           <w:lang w:val="es-PY"/>
         </w:rPr>
@@ -5837,6 +6084,7 @@
     </w:p>
     <w:p>
       <w:pPr>
+        <w:spacing w:after="30"/>
         <w:rPr>
           <w:lang w:val="es-PY"/>
         </w:rPr>
@@ -5852,6 +6100,7 @@
     </w:p>
     <w:p>
       <w:pPr>
+        <w:spacing w:after="30"/>
         <w:rPr>
           <w:lang w:val="es-PY"/>
         </w:rPr>
@@ -5866,6 +6115,7 @@
     </w:p>
     <w:p>
       <w:pPr>
+        <w:spacing w:after="30"/>
         <w:rPr>
           <w:lang w:val="es-PY"/>
         </w:rPr>
@@ -5880,6 +6130,7 @@
     </w:p>
     <w:p>
       <w:pPr>
+        <w:spacing w:after="30"/>
         <w:rPr>
           <w:lang w:val="es-PY"/>
         </w:rPr>
@@ -5894,6 +6145,8 @@
     </w:p>
     <w:p>
       <w:pPr>
+        <w:keepNext/>
+        <w:spacing w:after="30"/>
         <w:rPr>
           <w:lang w:val="es-PY"/>
         </w:rPr>
@@ -5909,6 +6162,7 @@
     </w:p>
     <w:p>
       <w:pPr>
+        <w:spacing w:after="30"/>
         <w:rPr>
           <w:lang w:val="es-PY"/>
         </w:rPr>
@@ -5924,6 +6178,7 @@
     </w:p>
     <w:p>
       <w:pPr>
+        <w:spacing w:after="30"/>
         <w:rPr>
           <w:lang w:val="es-PY"/>
         </w:rPr>
@@ -5938,6 +6193,7 @@
     </w:p>
     <w:p>
       <w:pPr>
+        <w:spacing w:after="30"/>
         <w:rPr>
           <w:lang w:val="es-PY"/>
         </w:rPr>
@@ -5952,6 +6208,8 @@
     </w:p>
     <w:p>
       <w:pPr>
+        <w:keepNext/>
+        <w:spacing w:after="30"/>
         <w:rPr>
           <w:lang w:val="es-PY"/>
         </w:rPr>
@@ -5995,6 +6253,7 @@
     </w:p>
     <w:p>
       <w:pPr>
+        <w:spacing w:after="30"/>
         <w:rPr>
           <w:lang w:val="es-PY"/>
         </w:rPr>
@@ -6009,6 +6268,7 @@
     </w:p>
     <w:p>
       <w:pPr>
+        <w:spacing w:after="30"/>
         <w:rPr>
           <w:lang w:val="es-PY"/>
         </w:rPr>
@@ -6026,6 +6286,7 @@
     <w:p>
       <w:pPr>
         <w:pStyle w:val="Ttulo3"/>
+        <w:spacing w:after="30"/>
         <w:rPr>
           <w:lang w:val="es-PY"/>
         </w:rPr>
@@ -6039,6 +6300,7 @@
     </w:p>
     <w:p>
       <w:pPr>
+        <w:spacing w:after="30"/>
         <w:rPr>
           <w:lang w:val="es-PY"/>
         </w:rPr>
@@ -6054,6 +6316,7 @@
     </w:p>
     <w:p>
       <w:pPr>
+        <w:spacing w:after="30"/>
         <w:rPr>
           <w:lang w:val="es-PY"/>
         </w:rPr>
@@ -6068,6 +6331,7 @@
     </w:p>
     <w:p>
       <w:pPr>
+        <w:spacing w:after="30"/>
         <w:rPr>
           <w:lang w:val="es-PY"/>
         </w:rPr>
@@ -6082,6 +6346,7 @@
     </w:p>
     <w:p>
       <w:pPr>
+        <w:spacing w:after="30"/>
         <w:rPr>
           <w:lang w:val="es-PY"/>
         </w:rPr>
@@ -6096,6 +6361,7 @@
     </w:p>
     <w:p>
       <w:pPr>
+        <w:spacing w:after="30"/>
         <w:rPr>
           <w:lang w:val="es-PY"/>
         </w:rPr>
@@ -6110,6 +6376,7 @@
     </w:p>
     <w:p>
       <w:pPr>
+        <w:spacing w:after="30"/>
         <w:rPr>
           <w:lang w:val="es-PY"/>
         </w:rPr>
@@ -6125,6 +6392,7 @@
     </w:p>
     <w:p>
       <w:pPr>
+        <w:spacing w:after="30"/>
         <w:rPr>
           <w:lang w:val="es-PY"/>
         </w:rPr>
@@ -6139,6 +6407,7 @@
     </w:p>
     <w:p>
       <w:pPr>
+        <w:spacing w:after="30"/>
         <w:rPr>
           <w:lang w:val="es-PY"/>
         </w:rPr>
@@ -6153,6 +6422,7 @@
     </w:p>
     <w:p>
       <w:pPr>
+        <w:spacing w:after="30"/>
         <w:rPr>
           <w:lang w:val="es-PY"/>
         </w:rPr>
@@ -6167,6 +6437,8 @@
     </w:p>
     <w:p>
       <w:pPr>
+        <w:keepNext/>
+        <w:spacing w:after="30"/>
         <w:rPr>
           <w:lang w:val="es-PY"/>
         </w:rPr>
@@ -6182,6 +6454,7 @@
     </w:p>
     <w:p>
       <w:pPr>
+        <w:spacing w:after="30"/>
         <w:rPr>
           <w:lang w:val="es-PY"/>
         </w:rPr>
@@ -6196,6 +6469,7 @@
     </w:p>
     <w:p>
       <w:pPr>
+        <w:spacing w:after="30"/>
         <w:rPr>
           <w:lang w:val="es-PY"/>
         </w:rPr>
@@ -6210,6 +6484,7 @@
     </w:p>
     <w:p>
       <w:pPr>
+        <w:spacing w:after="30"/>
         <w:rPr>
           <w:lang w:val="es-PY"/>
         </w:rPr>
@@ -6224,6 +6499,8 @@
     </w:p>
     <w:p>
       <w:pPr>
+        <w:keepNext/>
+        <w:spacing w:after="30"/>
         <w:rPr>
           <w:lang w:val="es-PY"/>
         </w:rPr>
@@ -6267,6 +6544,7 @@
     </w:p>
     <w:p>
       <w:pPr>
+        <w:spacing w:after="30"/>
         <w:rPr>
           <w:lang w:val="es-PY"/>
         </w:rPr>
@@ -6281,6 +6559,7 @@
     </w:p>
     <w:p>
       <w:pPr>
+        <w:spacing w:after="30"/>
         <w:rPr>
           <w:lang w:val="es-PY"/>
         </w:rPr>
@@ -6298,6 +6577,7 @@
     <w:p>
       <w:pPr>
         <w:pStyle w:val="Ttulo2"/>
+        <w:spacing w:after="30"/>
         <w:rPr>
           <w:lang w:val="es-PY"/>
         </w:rPr>
@@ -6312,6 +6592,7 @@
     <w:p>
       <w:pPr>
         <w:pStyle w:val="Ttulo3"/>
+        <w:spacing w:after="30"/>
         <w:rPr>
           <w:lang w:val="es-PY"/>
         </w:rPr>
@@ -6325,6 +6606,7 @@
     </w:p>
     <w:p>
       <w:pPr>
+        <w:spacing w:after="30"/>
         <w:rPr>
           <w:lang w:val="es-PY"/>
         </w:rPr>
@@ -6340,6 +6622,7 @@
     </w:p>
     <w:p>
       <w:pPr>
+        <w:spacing w:after="30"/>
         <w:rPr>
           <w:lang w:val="es-PY"/>
         </w:rPr>
@@ -6354,6 +6637,7 @@
     </w:p>
     <w:p>
       <w:pPr>
+        <w:spacing w:after="30"/>
         <w:rPr>
           <w:lang w:val="es-PY"/>
         </w:rPr>
@@ -6368,6 +6652,7 @@
     </w:p>
     <w:p>
       <w:pPr>
+        <w:spacing w:after="30"/>
         <w:rPr>
           <w:lang w:val="es-PY"/>
         </w:rPr>
@@ -6382,6 +6667,7 @@
     </w:p>
     <w:p>
       <w:pPr>
+        <w:spacing w:after="30"/>
         <w:rPr>
           <w:lang w:val="es-PY"/>
         </w:rPr>
@@ -6396,6 +6682,7 @@
     </w:p>
     <w:p>
       <w:pPr>
+        <w:spacing w:after="30"/>
         <w:rPr>
           <w:lang w:val="es-PY"/>
         </w:rPr>
@@ -6411,6 +6698,7 @@
     </w:p>
     <w:p>
       <w:pPr>
+        <w:spacing w:after="30"/>
         <w:rPr>
           <w:lang w:val="es-PY"/>
         </w:rPr>
@@ -6425,6 +6713,7 @@
     </w:p>
     <w:p>
       <w:pPr>
+        <w:spacing w:after="30"/>
         <w:rPr>
           <w:lang w:val="es-PY"/>
         </w:rPr>
@@ -6439,6 +6728,7 @@
     </w:p>
     <w:p>
       <w:pPr>
+        <w:spacing w:after="30"/>
         <w:rPr>
           <w:lang w:val="es-PY"/>
         </w:rPr>
@@ -6453,6 +6743,8 @@
     </w:p>
     <w:p>
       <w:pPr>
+        <w:keepNext/>
+        <w:spacing w:after="30"/>
         <w:rPr>
           <w:lang w:val="es-PY"/>
         </w:rPr>
@@ -6468,6 +6760,7 @@
     </w:p>
     <w:p>
       <w:pPr>
+        <w:spacing w:after="30"/>
         <w:rPr>
           <w:lang w:val="es-PY"/>
         </w:rPr>
@@ -6482,6 +6775,7 @@
     </w:p>
     <w:p>
       <w:pPr>
+        <w:spacing w:after="30"/>
         <w:rPr>
           <w:lang w:val="es-PY"/>
         </w:rPr>
@@ -6496,6 +6790,7 @@
     </w:p>
     <w:p>
       <w:pPr>
+        <w:spacing w:after="30"/>
         <w:rPr>
           <w:lang w:val="es-PY"/>
         </w:rPr>
@@ -6511,6 +6806,8 @@
     </w:p>
     <w:p>
       <w:pPr>
+        <w:keepNext/>
+        <w:spacing w:after="30"/>
         <w:rPr>
           <w:lang w:val="es-PY"/>
         </w:rPr>
@@ -6554,6 +6851,7 @@
     </w:p>
     <w:p>
       <w:pPr>
+        <w:spacing w:after="30"/>
         <w:rPr>
           <w:lang w:val="es-PY"/>
         </w:rPr>
@@ -6568,6 +6866,7 @@
     </w:p>
     <w:p>
       <w:pPr>
+        <w:spacing w:after="30"/>
         <w:rPr>
           <w:lang w:val="es-PY"/>
         </w:rPr>
@@ -6583,6 +6882,7 @@
     <w:p>
       <w:pPr>
         <w:pStyle w:val="Ttulo3"/>
+        <w:spacing w:after="30"/>
         <w:rPr>
           <w:lang w:val="es-PY"/>
         </w:rPr>
@@ -6596,6 +6896,7 @@
     </w:p>
     <w:p>
       <w:pPr>
+        <w:spacing w:after="30"/>
         <w:rPr>
           <w:lang w:val="es-PY"/>
         </w:rPr>
@@ -6611,6 +6912,7 @@
     </w:p>
     <w:p>
       <w:pPr>
+        <w:spacing w:after="30"/>
         <w:rPr>
           <w:lang w:val="es-PY"/>
         </w:rPr>
@@ -6625,6 +6927,7 @@
     </w:p>
     <w:p>
       <w:pPr>
+        <w:spacing w:after="30"/>
         <w:rPr>
           <w:lang w:val="es-PY"/>
         </w:rPr>
@@ -6639,6 +6942,7 @@
     </w:p>
     <w:p>
       <w:pPr>
+        <w:spacing w:after="30"/>
         <w:rPr>
           <w:lang w:val="es-PY"/>
         </w:rPr>
@@ -6653,6 +6957,7 @@
     </w:p>
     <w:p>
       <w:pPr>
+        <w:spacing w:after="30"/>
         <w:rPr>
           <w:lang w:val="es-PY"/>
         </w:rPr>
@@ -6667,6 +6972,7 @@
     </w:p>
     <w:p>
       <w:pPr>
+        <w:spacing w:after="30"/>
         <w:rPr>
           <w:lang w:val="es-PY"/>
         </w:rPr>
@@ -6682,6 +6988,7 @@
     </w:p>
     <w:p>
       <w:pPr>
+        <w:spacing w:after="30"/>
         <w:rPr>
           <w:lang w:val="es-PY"/>
         </w:rPr>
@@ -6696,6 +7003,7 @@
     </w:p>
     <w:p>
       <w:pPr>
+        <w:spacing w:after="30"/>
         <w:rPr>
           <w:lang w:val="es-PY"/>
         </w:rPr>
@@ -6710,6 +7018,7 @@
     </w:p>
     <w:p>
       <w:pPr>
+        <w:spacing w:after="30"/>
         <w:rPr>
           <w:lang w:val="es-PY"/>
         </w:rPr>
@@ -6724,6 +7033,8 @@
     </w:p>
     <w:p>
       <w:pPr>
+        <w:keepNext/>
+        <w:spacing w:after="30"/>
         <w:rPr>
           <w:lang w:val="es-PY"/>
         </w:rPr>
@@ -6739,6 +7050,7 @@
     </w:p>
     <w:p>
       <w:pPr>
+        <w:spacing w:after="30"/>
         <w:rPr>
           <w:lang w:val="es-PY"/>
         </w:rPr>
@@ -6753,6 +7065,7 @@
     </w:p>
     <w:p>
       <w:pPr>
+        <w:spacing w:after="30"/>
         <w:rPr>
           <w:lang w:val="es-PY"/>
         </w:rPr>
@@ -6767,6 +7080,7 @@
     </w:p>
     <w:p>
       <w:pPr>
+        <w:spacing w:after="30"/>
         <w:rPr>
           <w:lang w:val="es-PY"/>
         </w:rPr>
@@ -6781,6 +7095,8 @@
     </w:p>
     <w:p>
       <w:pPr>
+        <w:keepNext/>
+        <w:spacing w:after="30"/>
         <w:rPr>
           <w:lang w:val="es-PY"/>
         </w:rPr>
@@ -6824,6 +7140,7 @@
     </w:p>
     <w:p>
       <w:pPr>
+        <w:spacing w:after="30"/>
         <w:rPr>
           <w:lang w:val="es-PY"/>
         </w:rPr>
@@ -6838,6 +7155,7 @@
     </w:p>
     <w:p>
       <w:pPr>
+        <w:spacing w:after="30"/>
         <w:rPr>
           <w:lang w:val="es-PY"/>
         </w:rPr>
@@ -6853,6 +7171,7 @@
     <w:p>
       <w:pPr>
         <w:pStyle w:val="Ttulo3"/>
+        <w:spacing w:after="30"/>
         <w:rPr>
           <w:lang w:val="es-PY"/>
         </w:rPr>
@@ -6866,6 +7185,7 @@
     </w:p>
     <w:p>
       <w:pPr>
+        <w:spacing w:after="30"/>
         <w:rPr>
           <w:lang w:val="es-PY"/>
         </w:rPr>
@@ -6881,6 +7201,7 @@
     </w:p>
     <w:p>
       <w:pPr>
+        <w:spacing w:after="30"/>
         <w:rPr>
           <w:lang w:val="es-PY"/>
         </w:rPr>
@@ -6895,6 +7216,7 @@
     </w:p>
     <w:p>
       <w:pPr>
+        <w:spacing w:after="30"/>
         <w:rPr>
           <w:lang w:val="es-PY"/>
         </w:rPr>
@@ -6909,6 +7231,7 @@
     </w:p>
     <w:p>
       <w:pPr>
+        <w:spacing w:after="30"/>
         <w:rPr>
           <w:lang w:val="es-PY"/>
         </w:rPr>
@@ -6923,6 +7246,7 @@
     </w:p>
     <w:p>
       <w:pPr>
+        <w:spacing w:after="30"/>
         <w:rPr>
           <w:lang w:val="es-PY"/>
         </w:rPr>
@@ -6937,6 +7261,7 @@
     </w:p>
     <w:p>
       <w:pPr>
+        <w:spacing w:after="30"/>
         <w:rPr>
           <w:lang w:val="es-PY"/>
         </w:rPr>
@@ -6952,6 +7277,7 @@
     </w:p>
     <w:p>
       <w:pPr>
+        <w:spacing w:after="30"/>
         <w:rPr>
           <w:lang w:val="es-PY"/>
         </w:rPr>
@@ -6966,6 +7292,7 @@
     </w:p>
     <w:p>
       <w:pPr>
+        <w:spacing w:after="30"/>
         <w:rPr>
           <w:lang w:val="es-PY"/>
         </w:rPr>
@@ -6980,6 +7307,7 @@
     </w:p>
     <w:p>
       <w:pPr>
+        <w:spacing w:after="30"/>
         <w:rPr>
           <w:lang w:val="es-PY"/>
         </w:rPr>
@@ -6994,6 +7322,8 @@
     </w:p>
     <w:p>
       <w:pPr>
+        <w:keepNext/>
+        <w:spacing w:after="30"/>
         <w:rPr>
           <w:lang w:val="es-PY"/>
         </w:rPr>
@@ -7009,6 +7339,7 @@
     </w:p>
     <w:p>
       <w:pPr>
+        <w:spacing w:after="30"/>
         <w:rPr>
           <w:lang w:val="es-PY"/>
         </w:rPr>
@@ -7023,6 +7354,7 @@
     </w:p>
     <w:p>
       <w:pPr>
+        <w:spacing w:after="30"/>
         <w:rPr>
           <w:lang w:val="es-PY"/>
         </w:rPr>
@@ -7037,6 +7369,7 @@
     </w:p>
     <w:p>
       <w:pPr>
+        <w:spacing w:after="30"/>
         <w:rPr>
           <w:lang w:val="es-PY"/>
         </w:rPr>
@@ -7051,6 +7384,8 @@
     </w:p>
     <w:p>
       <w:pPr>
+        <w:keepNext/>
+        <w:spacing w:after="30"/>
         <w:rPr>
           <w:lang w:val="es-PY"/>
         </w:rPr>
@@ -7094,6 +7429,7 @@
     </w:p>
     <w:p>
       <w:pPr>
+        <w:spacing w:after="30"/>
         <w:rPr>
           <w:lang w:val="es-PY"/>
         </w:rPr>
@@ -7108,6 +7444,7 @@
     </w:p>
     <w:p>
       <w:pPr>
+        <w:spacing w:after="30"/>
         <w:rPr>
           <w:lang w:val="es-PY"/>
         </w:rPr>
@@ -7123,6 +7460,7 @@
     <w:p>
       <w:pPr>
         <w:pStyle w:val="Ttulo3"/>
+        <w:spacing w:after="30"/>
         <w:rPr>
           <w:lang w:val="es-PY"/>
         </w:rPr>
@@ -7136,6 +7474,7 @@
     </w:p>
     <w:p>
       <w:pPr>
+        <w:spacing w:after="30"/>
         <w:rPr>
           <w:lang w:val="es-PY"/>
         </w:rPr>
@@ -7151,6 +7490,7 @@
     </w:p>
     <w:p>
       <w:pPr>
+        <w:spacing w:after="30"/>
         <w:rPr>
           <w:lang w:val="es-PY"/>
         </w:rPr>
@@ -7165,6 +7505,7 @@
     </w:p>
     <w:p>
       <w:pPr>
+        <w:spacing w:after="30"/>
         <w:rPr>
           <w:lang w:val="es-PY"/>
         </w:rPr>
@@ -7179,6 +7520,7 @@
     </w:p>
     <w:p>
       <w:pPr>
+        <w:spacing w:after="30"/>
         <w:rPr>
           <w:lang w:val="es-PY"/>
         </w:rPr>
@@ -7193,6 +7535,7 @@
     </w:p>
     <w:p>
       <w:pPr>
+        <w:spacing w:after="30"/>
         <w:rPr>
           <w:lang w:val="es-PY"/>
         </w:rPr>
@@ -7207,6 +7550,7 @@
     </w:p>
     <w:p>
       <w:pPr>
+        <w:spacing w:after="30"/>
         <w:rPr>
           <w:lang w:val="es-PY"/>
         </w:rPr>
@@ -7222,6 +7566,7 @@
     </w:p>
     <w:p>
       <w:pPr>
+        <w:spacing w:after="30"/>
         <w:rPr>
           <w:lang w:val="es-PY"/>
         </w:rPr>
@@ -7236,6 +7581,7 @@
     </w:p>
     <w:p>
       <w:pPr>
+        <w:spacing w:after="30"/>
         <w:rPr>
           <w:lang w:val="es-PY"/>
         </w:rPr>
@@ -7250,6 +7596,7 @@
     </w:p>
     <w:p>
       <w:pPr>
+        <w:spacing w:after="30"/>
         <w:rPr>
           <w:lang w:val="es-PY"/>
         </w:rPr>
@@ -7264,6 +7611,8 @@
     </w:p>
     <w:p>
       <w:pPr>
+        <w:keepNext/>
+        <w:spacing w:after="30"/>
         <w:rPr>
           <w:lang w:val="es-PY"/>
         </w:rPr>
@@ -7279,6 +7628,7 @@
     </w:p>
     <w:p>
       <w:pPr>
+        <w:spacing w:after="30"/>
         <w:rPr>
           <w:lang w:val="es-PY"/>
         </w:rPr>
@@ -7293,6 +7643,7 @@
     </w:p>
     <w:p>
       <w:pPr>
+        <w:spacing w:after="30"/>
         <w:rPr>
           <w:lang w:val="es-PY"/>
         </w:rPr>
@@ -7307,6 +7658,7 @@
     </w:p>
     <w:p>
       <w:pPr>
+        <w:spacing w:after="30"/>
         <w:rPr>
           <w:lang w:val="es-PY"/>
         </w:rPr>
@@ -7321,6 +7673,8 @@
     </w:p>
     <w:p>
       <w:pPr>
+        <w:keepNext/>
+        <w:spacing w:after="30"/>
         <w:rPr>
           <w:lang w:val="es-PY"/>
         </w:rPr>
@@ -7364,6 +7718,7 @@
     </w:p>
     <w:p>
       <w:pPr>
+        <w:spacing w:after="30"/>
         <w:rPr>
           <w:lang w:val="es-PY"/>
         </w:rPr>
@@ -7378,6 +7733,7 @@
     </w:p>
     <w:p>
       <w:pPr>
+        <w:spacing w:after="30"/>
         <w:rPr>
           <w:lang w:val="es-PY"/>
         </w:rPr>
@@ -7392,20 +7748,9 @@
     </w:p>
     <w:p>
       <w:pPr>
-        <w:rPr>
-          <w:lang w:val="es-PY"/>
-        </w:rPr>
-      </w:pPr>
-      <w:r>
-        <w:rPr>
-          <w:lang w:val="es-PY"/>
-        </w:rPr>
-        <w:br w:type="page"/>
-      </w:r>
-    </w:p>
-    <w:p>
-      <w:pPr>
         <w:pStyle w:val="Ttulo1"/>
+        <w:pageBreakBefore/>
+        <w:spacing w:after="0" w:line="228" w:lineRule="auto"/>
         <w:rPr>
           <w:lang w:val="es-PY"/>
         </w:rPr>
@@ -7421,6 +7766,7 @@
     <w:p>
       <w:pPr>
         <w:pStyle w:val="Ttulo2"/>
+        <w:spacing w:after="0" w:line="228" w:lineRule="auto"/>
         <w:rPr>
           <w:lang w:val="es-PY"/>
         </w:rPr>
@@ -7434,6 +7780,7 @@
     </w:p>
     <w:p>
       <w:pPr>
+        <w:spacing w:after="0" w:line="228" w:lineRule="auto"/>
         <w:rPr>
           <w:lang w:val="es-PY"/>
         </w:rPr>
@@ -7448,6 +7795,7 @@
     </w:p>
     <w:p>
       <w:pPr>
+        <w:spacing w:after="0" w:line="228" w:lineRule="auto"/>
         <w:rPr>
           <w:lang w:val="es-PY"/>
         </w:rPr>
@@ -7464,6 +7812,7 @@
     </w:p>
     <w:p>
       <w:pPr>
+        <w:spacing w:after="0" w:line="228" w:lineRule="auto"/>
         <w:rPr>
           <w:lang w:val="es-PY"/>
         </w:rPr>
@@ -7478,6 +7827,7 @@
     </w:p>
     <w:p>
       <w:pPr>
+        <w:spacing w:after="0" w:line="228" w:lineRule="auto"/>
         <w:rPr>
           <w:lang w:val="es-PY"/>
         </w:rPr>
@@ -7492,6 +7842,7 @@
     </w:p>
     <w:p>
       <w:pPr>
+        <w:spacing w:after="0" w:line="228" w:lineRule="auto"/>
         <w:rPr>
           <w:lang w:val="es-PY"/>
         </w:rPr>
@@ -7507,6 +7858,7 @@
     <w:p>
       <w:pPr>
         <w:pStyle w:val="Ttulo2"/>
+        <w:spacing w:after="0" w:line="228" w:lineRule="auto"/>
         <w:rPr>
           <w:lang w:val="es-PY"/>
         </w:rPr>
@@ -7520,6 +7872,7 @@
     </w:p>
     <w:p>
       <w:pPr>
+        <w:spacing w:after="0" w:line="228" w:lineRule="auto"/>
         <w:rPr>
           <w:lang w:val="es-PY"/>
         </w:rPr>
@@ -7534,6 +7887,7 @@
     </w:p>
     <w:p>
       <w:pPr>
+        <w:spacing w:after="0" w:line="228" w:lineRule="auto"/>
         <w:rPr>
           <w:lang w:val="es-PY"/>
         </w:rPr>
@@ -7548,6 +7902,7 @@
     </w:p>
     <w:p>
       <w:pPr>
+        <w:spacing w:after="0" w:line="228" w:lineRule="auto"/>
         <w:rPr>
           <w:lang w:val="es-PY"/>
         </w:rPr>
@@ -7562,6 +7917,7 @@
     </w:p>
     <w:p>
       <w:pPr>
+        <w:spacing w:after="0" w:line="228" w:lineRule="auto"/>
         <w:rPr>
           <w:lang w:val="es-PY"/>
         </w:rPr>
@@ -7576,6 +7932,7 @@
     </w:p>
     <w:p>
       <w:pPr>
+        <w:spacing w:after="0" w:line="228" w:lineRule="auto"/>
         <w:rPr>
           <w:lang w:val="es-PY"/>
         </w:rPr>
@@ -7591,6 +7948,7 @@
     <w:p>
       <w:pPr>
         <w:pStyle w:val="Ttulo2"/>
+        <w:spacing w:after="0" w:line="228" w:lineRule="auto"/>
         <w:rPr>
           <w:lang w:val="es-PY"/>
         </w:rPr>
@@ -7604,6 +7962,7 @@
     </w:p>
     <w:p>
       <w:pPr>
+        <w:spacing w:after="0" w:line="228" w:lineRule="auto"/>
         <w:rPr>
           <w:lang w:val="es-PY"/>
         </w:rPr>
@@ -7624,6 +7983,7 @@
     </w:p>
     <w:p>
       <w:pPr>
+        <w:spacing w:after="0" w:line="228" w:lineRule="auto"/>
         <w:rPr>
           <w:lang w:val="es-PY"/>
         </w:rPr>
@@ -7638,6 +7998,7 @@
     </w:p>
     <w:p>
       <w:pPr>
+        <w:spacing w:after="0" w:line="228" w:lineRule="auto"/>
         <w:rPr>
           <w:lang w:val="es-PY"/>
         </w:rPr>
@@ -7652,6 +8013,7 @@
     </w:p>
     <w:p>
       <w:pPr>
+        <w:spacing w:after="0" w:line="228" w:lineRule="auto"/>
         <w:rPr>
           <w:lang w:val="es-PY"/>
         </w:rPr>
@@ -7666,6 +8028,7 @@
     </w:p>
     <w:p>
       <w:pPr>
+        <w:spacing w:after="0" w:line="228" w:lineRule="auto"/>
         <w:rPr>
           <w:lang w:val="es-PY"/>
         </w:rPr>
@@ -7687,6 +8050,7 @@
     <w:p>
       <w:pPr>
         <w:pStyle w:val="Ttulo2"/>
+        <w:spacing w:after="0" w:line="228" w:lineRule="auto"/>
         <w:rPr>
           <w:lang w:val="es-PY"/>
         </w:rPr>
@@ -7700,6 +8064,7 @@
     </w:p>
     <w:p>
       <w:pPr>
+        <w:spacing w:after="0" w:line="228" w:lineRule="auto"/>
         <w:rPr>
           <w:lang w:val="es-PY"/>
         </w:rPr>
@@ -7714,6 +8079,7 @@
     </w:p>
     <w:p>
       <w:pPr>
+        <w:spacing w:after="0" w:line="228" w:lineRule="auto"/>
         <w:rPr>
           <w:lang w:val="es-PY"/>
         </w:rPr>
@@ -7728,6 +8094,7 @@
     </w:p>
     <w:p>
       <w:pPr>
+        <w:spacing w:after="0" w:line="228" w:lineRule="auto"/>
         <w:rPr>
           <w:lang w:val="es-PY"/>
         </w:rPr>
@@ -7742,6 +8109,7 @@
     </w:p>
     <w:p>
       <w:pPr>
+        <w:spacing w:after="0" w:line="228" w:lineRule="auto"/>
         <w:rPr>
           <w:lang w:val="es-PY"/>
         </w:rPr>
@@ -7756,6 +8124,7 @@
     </w:p>
     <w:p>
       <w:pPr>
+        <w:spacing w:after="0" w:line="228" w:lineRule="auto"/>
         <w:rPr>
           <w:lang w:val="es-PY"/>
         </w:rPr>
@@ -7771,6 +8140,7 @@
     <w:p>
       <w:pPr>
         <w:pStyle w:val="Ttulo2"/>
+        <w:spacing w:after="0" w:line="228" w:lineRule="auto"/>
         <w:rPr>
           <w:lang w:val="es-PY"/>
         </w:rPr>
@@ -7785,6 +8155,7 @@
     </w:p>
     <w:p>
       <w:pPr>
+        <w:spacing w:after="0" w:line="228" w:lineRule="auto"/>
         <w:rPr>
           <w:lang w:val="es-PY"/>
         </w:rPr>
@@ -7799,6 +8170,7 @@
     </w:p>
     <w:p>
       <w:pPr>
+        <w:spacing w:after="0" w:line="228" w:lineRule="auto"/>
         <w:rPr>
           <w:lang w:val="es-PY"/>
         </w:rPr>
@@ -7813,6 +8185,7 @@
     </w:p>
     <w:p>
       <w:pPr>
+        <w:spacing w:after="0" w:line="228" w:lineRule="auto"/>
         <w:rPr>
           <w:lang w:val="es-PY"/>
         </w:rPr>
@@ -7827,6 +8200,7 @@
     </w:p>
     <w:p>
       <w:pPr>
+        <w:spacing w:after="0" w:line="228" w:lineRule="auto"/>
         <w:rPr>
           <w:lang w:val="es-PY"/>
         </w:rPr>
@@ -7841,6 +8215,7 @@
     </w:p>
     <w:p>
       <w:pPr>
+        <w:spacing w:after="0" w:line="228" w:lineRule="auto"/>
         <w:rPr>
           <w:lang w:val="es-PY"/>
         </w:rPr>
@@ -7857,20 +8232,9 @@
     </w:p>
     <w:p>
       <w:pPr>
-        <w:rPr>
-          <w:lang w:val="es-PY"/>
-        </w:rPr>
-      </w:pPr>
-      <w:r>
-        <w:rPr>
-          <w:lang w:val="es-PY"/>
-        </w:rPr>
-        <w:br w:type="page"/>
-      </w:r>
-    </w:p>
-    <w:p>
-      <w:pPr>
         <w:pStyle w:val="Ttulo1"/>
+        <w:pageBreakBefore/>
+        <w:spacing w:after="0" w:line="228" w:lineRule="auto"/>
         <w:rPr>
           <w:lang w:val="es-PY"/>
         </w:rPr>
@@ -7884,6 +8248,7 @@
     </w:p>
     <w:p>
       <w:pPr>
+        <w:spacing w:after="0" w:line="228" w:lineRule="auto"/>
         <w:rPr>
           <w:lang w:val="es-PY"/>
         </w:rPr>
@@ -7900,6 +8265,7 @@
     <w:p>
       <w:pPr>
         <w:pStyle w:val="Ttulo3"/>
+        <w:spacing w:after="0" w:line="228" w:lineRule="auto"/>
         <w:rPr>
           <w:lang w:val="es-PY"/>
         </w:rPr>
@@ -7913,6 +8279,7 @@
     </w:p>
     <w:p>
       <w:pPr>
+        <w:spacing w:after="0" w:line="228" w:lineRule="auto"/>
         <w:rPr>
           <w:lang w:val="es-PY"/>
         </w:rPr>
@@ -7928,6 +8295,7 @@
     <w:p>
       <w:pPr>
         <w:pStyle w:val="Ttulo3"/>
+        <w:spacing w:after="0" w:line="228" w:lineRule="auto"/>
         <w:rPr>
           <w:lang w:val="es-PY"/>
         </w:rPr>
@@ -7941,6 +8309,7 @@
     </w:p>
     <w:p>
       <w:pPr>
+        <w:spacing w:after="0" w:line="228" w:lineRule="auto"/>
         <w:rPr>
           <w:lang w:val="es-PY"/>
         </w:rPr>
@@ -7956,6 +8325,7 @@
     <w:p>
       <w:pPr>
         <w:pStyle w:val="Ttulo3"/>
+        <w:spacing w:after="0" w:line="228" w:lineRule="auto"/>
         <w:rPr>
           <w:lang w:val="es-PY"/>
         </w:rPr>
@@ -7969,6 +8339,7 @@
     </w:p>
     <w:p>
       <w:pPr>
+        <w:spacing w:after="0" w:line="228" w:lineRule="auto"/>
         <w:rPr>
           <w:lang w:val="es-PY"/>
         </w:rPr>
@@ -7984,6 +8355,7 @@
     <w:p>
       <w:pPr>
         <w:pStyle w:val="Ttulo3"/>
+        <w:spacing w:after="0" w:line="228" w:lineRule="auto"/>
         <w:rPr>
           <w:lang w:val="es-PY"/>
         </w:rPr>
@@ -7997,6 +8369,7 @@
     </w:p>
     <w:p>
       <w:pPr>
+        <w:spacing w:after="0" w:line="228" w:lineRule="auto"/>
         <w:rPr>
           <w:lang w:val="es-PY"/>
         </w:rPr>
@@ -8012,6 +8385,7 @@
     <w:p>
       <w:pPr>
         <w:pStyle w:val="Ttulo3"/>
+        <w:spacing w:after="0" w:line="228" w:lineRule="auto"/>
         <w:rPr>
           <w:lang w:val="es-PY"/>
         </w:rPr>
@@ -8025,6 +8399,7 @@
     </w:p>
     <w:p>
       <w:pPr>
+        <w:spacing w:after="0" w:line="228" w:lineRule="auto"/>
         <w:rPr>
           <w:lang w:val="es-PY"/>
         </w:rPr>
@@ -8040,6 +8415,7 @@
     <w:p>
       <w:pPr>
         <w:pStyle w:val="Ttulo3"/>
+        <w:spacing w:after="0" w:line="228" w:lineRule="auto"/>
         <w:rPr>
           <w:lang w:val="es-PY"/>
         </w:rPr>
@@ -8053,6 +8429,7 @@
     </w:p>
     <w:p>
       <w:pPr>
+        <w:spacing w:after="0" w:line="228" w:lineRule="auto"/>
         <w:rPr>
           <w:lang w:val="es-PY"/>
         </w:rPr>
@@ -8068,6 +8445,7 @@
     <w:p>
       <w:pPr>
         <w:pStyle w:val="Ttulo3"/>
+        <w:spacing w:after="0" w:line="228" w:lineRule="auto"/>
         <w:rPr>
           <w:lang w:val="es-PY"/>
         </w:rPr>
@@ -8081,6 +8459,7 @@
     </w:p>
     <w:p>
       <w:pPr>
+        <w:spacing w:after="0" w:line="228" w:lineRule="auto"/>
         <w:rPr>
           <w:lang w:val="es-PY"/>
         </w:rPr>
@@ -8100,6 +8479,7 @@
     <w:p>
       <w:pPr>
         <w:pStyle w:val="Ttulo3"/>
+        <w:spacing w:after="0" w:line="228" w:lineRule="auto"/>
         <w:rPr>
           <w:lang w:val="es-PY"/>
         </w:rPr>
@@ -8113,6 +8493,7 @@
     </w:p>
     <w:p>
       <w:pPr>
+        <w:spacing w:after="0" w:line="228" w:lineRule="auto"/>
         <w:rPr>
           <w:lang w:val="es-PY"/>
         </w:rPr>
@@ -8128,6 +8509,7 @@
     <w:p>
       <w:pPr>
         <w:pStyle w:val="Ttulo3"/>
+        <w:spacing w:after="0" w:line="228" w:lineRule="auto"/>
         <w:rPr>
           <w:lang w:val="es-PY"/>
         </w:rPr>
@@ -8141,6 +8523,7 @@
     </w:p>
     <w:p>
       <w:pPr>
+        <w:spacing w:after="0" w:line="228" w:lineRule="auto"/>
         <w:rPr>
           <w:lang w:val="es-PY"/>
         </w:rPr>
@@ -8156,6 +8539,7 @@
     <w:p>
       <w:pPr>
         <w:pStyle w:val="Ttulo3"/>
+        <w:spacing w:after="0" w:line="228" w:lineRule="auto"/>
         <w:rPr>
           <w:lang w:val="es-PY"/>
         </w:rPr>
@@ -8169,6 +8553,7 @@
     </w:p>
     <w:p>
       <w:pPr>
+        <w:spacing w:after="0" w:line="228" w:lineRule="auto"/>
         <w:rPr>
           <w:lang w:val="es-PY"/>
         </w:rPr>
@@ -8184,6 +8569,7 @@
     <w:p>
       <w:pPr>
         <w:pStyle w:val="Ttulo3"/>
+        <w:spacing w:after="0" w:line="228" w:lineRule="auto"/>
         <w:rPr>
           <w:lang w:val="es-PY"/>
         </w:rPr>
@@ -8197,6 +8583,7 @@
     </w:p>
     <w:p>
       <w:pPr>
+        <w:spacing w:after="0" w:line="228" w:lineRule="auto"/>
         <w:rPr>
           <w:lang w:val="es-PY"/>
         </w:rPr>
@@ -8214,6 +8601,7 @@
     <w:p>
       <w:pPr>
         <w:pStyle w:val="Ttulo3"/>
+        <w:spacing w:after="0" w:line="228" w:lineRule="auto"/>
         <w:rPr>
           <w:lang w:val="es-PY"/>
         </w:rPr>
@@ -8227,6 +8615,7 @@
     </w:p>
     <w:p>
       <w:pPr>
+        <w:spacing w:after="0" w:line="228" w:lineRule="auto"/>
         <w:rPr>
           <w:lang w:val="es-PY"/>
         </w:rPr>
@@ -8258,6 +8647,7 @@
     <w:p>
       <w:pPr>
         <w:pStyle w:val="Ttulo3"/>
+        <w:spacing w:after="0" w:line="228" w:lineRule="auto"/>
         <w:rPr>
           <w:lang w:val="es-PY"/>
         </w:rPr>
@@ -8271,6 +8661,7 @@
     </w:p>
     <w:p>
       <w:pPr>
+        <w:spacing w:after="0" w:line="228" w:lineRule="auto"/>
         <w:rPr>
           <w:lang w:val="es-PY"/>
         </w:rPr>
@@ -8302,6 +8693,7 @@
     <w:p>
       <w:pPr>
         <w:pStyle w:val="Ttulo3"/>
+        <w:spacing w:after="0" w:line="228" w:lineRule="auto"/>
         <w:rPr>
           <w:lang w:val="es-PY"/>
         </w:rPr>
@@ -8315,6 +8707,7 @@
     </w:p>
     <w:p>
       <w:pPr>
+        <w:spacing w:after="0" w:line="228" w:lineRule="auto"/>
         <w:rPr>
           <w:lang w:val="es-PY"/>
         </w:rPr>
@@ -8330,6 +8723,7 @@
     <w:p>
       <w:pPr>
         <w:pStyle w:val="Ttulo3"/>
+        <w:spacing w:after="0" w:line="228" w:lineRule="auto"/>
         <w:rPr>
           <w:lang w:val="es-PY"/>
         </w:rPr>
@@ -8343,6 +8737,7 @@
     </w:p>
     <w:p>
       <w:pPr>
+        <w:spacing w:after="0" w:line="228" w:lineRule="auto"/>
         <w:rPr>
           <w:lang w:val="es-PY"/>
         </w:rPr>
@@ -8390,6 +8785,7 @@
     <w:p>
       <w:pPr>
         <w:pStyle w:val="Ttulo3"/>
+        <w:spacing w:after="0" w:line="228" w:lineRule="auto"/>
         <w:rPr>
           <w:lang w:val="es-PY"/>
         </w:rPr>
@@ -8403,6 +8799,7 @@
     </w:p>
     <w:p>
       <w:pPr>
+        <w:spacing w:after="0" w:line="228" w:lineRule="auto"/>
         <w:rPr>
           <w:lang w:val="es-PY"/>
         </w:rPr>
@@ -8418,6 +8815,7 @@
     <w:p>
       <w:pPr>
         <w:pStyle w:val="Ttulo3"/>
+        <w:spacing w:after="0" w:line="228" w:lineRule="auto"/>
         <w:rPr>
           <w:lang w:val="es-PY"/>
         </w:rPr>
@@ -8431,6 +8829,7 @@
     </w:p>
     <w:p>
       <w:pPr>
+        <w:spacing w:after="0" w:line="228" w:lineRule="auto"/>
         <w:rPr>
           <w:lang w:val="es-PY"/>
         </w:rPr>
@@ -8446,6 +8845,7 @@
     <w:p>
       <w:pPr>
         <w:pStyle w:val="Ttulo3"/>
+        <w:spacing w:after="0" w:line="228" w:lineRule="auto"/>
         <w:rPr>
           <w:lang w:val="es-PY"/>
         </w:rPr>
@@ -8459,6 +8859,7 @@
     </w:p>
     <w:p>
       <w:pPr>
+        <w:spacing w:after="0" w:line="228" w:lineRule="auto"/>
         <w:rPr>
           <w:lang w:val="es-PY"/>
         </w:rPr>
@@ -8475,6 +8876,7 @@
     <w:p>
       <w:pPr>
         <w:pStyle w:val="Ttulo3"/>
+        <w:spacing w:after="0" w:line="228" w:lineRule="auto"/>
         <w:rPr>
           <w:lang w:val="es-PY"/>
         </w:rPr>
@@ -8488,6 +8890,7 @@
     </w:p>
     <w:p>
       <w:pPr>
+        <w:spacing w:after="0" w:line="228" w:lineRule="auto"/>
         <w:rPr>
           <w:lang w:val="es-PY"/>
         </w:rPr>
@@ -8503,6 +8906,7 @@
     <w:p>
       <w:pPr>
         <w:pStyle w:val="Ttulo3"/>
+        <w:spacing w:after="0" w:line="228" w:lineRule="auto"/>
         <w:rPr>
           <w:lang w:val="es-PY"/>
         </w:rPr>
@@ -8516,6 +8920,7 @@
     </w:p>
     <w:p>
       <w:pPr>
+        <w:spacing w:after="0" w:line="228" w:lineRule="auto"/>
         <w:rPr>
           <w:lang w:val="es-PY"/>
         </w:rPr>
@@ -8531,6 +8936,7 @@
     <w:p>
       <w:pPr>
         <w:pStyle w:val="Ttulo1"/>
+        <w:spacing w:after="0" w:line="228" w:lineRule="auto"/>
         <w:rPr>
           <w:lang w:val="es-PY"/>
         </w:rPr>
@@ -8542,6 +8948,7 @@
     <w:p>
       <w:pPr>
         <w:pStyle w:val="Ttulo3"/>
+        <w:spacing w:after="0" w:line="228" w:lineRule="auto"/>
         <w:rPr>
           <w:lang w:val="es-PY"/>
         </w:rPr>
@@ -8556,6 +8963,7 @@
     </w:p>
     <w:p>
       <w:pPr>
+        <w:spacing w:after="0" w:line="228" w:lineRule="auto"/>
         <w:rPr>
           <w:lang w:val="es-PY"/>
         </w:rPr>
@@ -8583,6 +8991,7 @@
     </w:p>
     <w:p>
       <w:pPr>
+        <w:spacing w:after="0" w:line="228" w:lineRule="auto"/>
         <w:rPr>
           <w:lang w:val="es-PY"/>
         </w:rPr>
@@ -8596,6 +9005,7 @@
     </w:p>
     <w:p>
       <w:pPr>
+        <w:spacing w:after="0" w:line="228" w:lineRule="auto"/>
         <w:rPr>
           <w:lang w:val="es-PY"/>
         </w:rPr>
@@ -8609,6 +9019,7 @@
     </w:p>
     <w:p>
       <w:pPr>
+        <w:spacing w:after="0" w:line="228" w:lineRule="auto"/>
         <w:rPr>
           <w:lang w:val="es-PY"/>
         </w:rPr>
@@ -8622,6 +9033,7 @@
     </w:p>
     <w:p>
       <w:pPr>
+        <w:spacing w:after="0" w:line="228" w:lineRule="auto"/>
         <w:rPr>
           <w:lang w:val="es-PY"/>
         </w:rPr>
@@ -8636,6 +9048,7 @@
     <w:p>
       <w:pPr>
         <w:pStyle w:val="Ttulo3"/>
+        <w:spacing w:after="0" w:line="228" w:lineRule="auto"/>
       </w:pPr>
       <w:proofErr w:type="spellStart"/>
       <w:r>
@@ -8663,7 +9076,7 @@
     </w:p>
     <w:tbl>
       <w:tblPr>
-        <w:tblW w:w="9412" w:type="dxa"/>
+        <w:tblW w:w="5000" w:type="pct"/>
         <w:tblBorders>
           <w:top w:val="single" w:sz="4" w:space="0" w:color="BDBDBD"/>
           <w:left w:val="single" w:sz="4" w:space="0" w:color="BDBDBD"/>
@@ -8672,13 +9085,12 @@
           <w:insideH w:val="single" w:sz="4" w:space="0" w:color="BDBDBD"/>
           <w:insideV w:val="single" w:sz="4" w:space="0" w:color="BDBDBD"/>
         </w:tblBorders>
-        <w:tblLayout w:type="fixed"/>
         <w:tblLook w:val="04A0" w:firstRow="1" w:lastRow="0" w:firstColumn="1" w:lastColumn="0" w:noHBand="0" w:noVBand="1"/>
       </w:tblPr>
       <w:tblGrid>
-        <w:gridCol w:w="3708"/>
-        <w:gridCol w:w="2654"/>
-        <w:gridCol w:w="3050"/>
+        <w:gridCol w:w="4255"/>
+        <w:gridCol w:w="3046"/>
+        <w:gridCol w:w="3500"/>
       </w:tblGrid>
       <w:tr>
         <w:trPr>
@@ -8686,10 +9098,13 @@
         </w:trPr>
         <w:tc>
           <w:tcPr>
-            <w:tcW w:w="3137" w:type="dxa"/>
+            <w:tcW w:w="3600" w:type="dxa"/>
             <w:shd w:val="clear" w:color="auto" w:fill="1B5E20"/>
           </w:tcPr>
           <w:p>
+            <w:pPr>
+              <w:spacing w:after="0" w:line="228" w:lineRule="auto"/>
+            </w:pPr>
             <w:r>
               <w:rPr>
                 <w:b/>
@@ -8702,10 +9117,13 @@
         </w:tc>
         <w:tc>
           <w:tcPr>
-            <w:tcW w:w="3137" w:type="dxa"/>
+            <w:tcW w:w="3600" w:type="dxa"/>
             <w:shd w:val="clear" w:color="auto" w:fill="1B5E20"/>
           </w:tcPr>
           <w:p>
+            <w:pPr>
+              <w:spacing w:after="0" w:line="228" w:lineRule="auto"/>
+            </w:pPr>
             <w:r>
               <w:rPr>
                 <w:b/>
@@ -8718,10 +9136,13 @@
         </w:tc>
         <w:tc>
           <w:tcPr>
-            <w:tcW w:w="3137" w:type="dxa"/>
+            <w:tcW w:w="3600" w:type="dxa"/>
             <w:shd w:val="clear" w:color="auto" w:fill="1B5E20"/>
           </w:tcPr>
           <w:p>
+            <w:pPr>
+              <w:spacing w:after="0" w:line="228" w:lineRule="auto"/>
+            </w:pPr>
             <w:r>
               <w:rPr>
                 <w:b/>
@@ -8739,9 +9160,12 @@
         </w:trPr>
         <w:tc>
           <w:tcPr>
-            <w:tcW w:w="4400" w:type="dxa"/>
+            <w:tcW w:w="5049" w:type="dxa"/>
           </w:tcPr>
           <w:p>
+            <w:pPr>
+              <w:spacing w:after="0" w:line="228" w:lineRule="auto"/>
+            </w:pPr>
             <w:r>
               <w:rPr>
                 <w:b/>
@@ -8753,9 +9177,12 @@
         </w:tc>
         <w:tc>
           <w:tcPr>
-            <w:tcW w:w="1400" w:type="dxa"/>
+            <w:tcW w:w="1607" w:type="dxa"/>
           </w:tcPr>
           <w:p>
+            <w:pPr>
+              <w:spacing w:after="0" w:line="228" w:lineRule="auto"/>
+            </w:pPr>
             <w:r>
               <w:rPr>
                 <w:b/>
@@ -8767,10 +9194,11 @@
         </w:tc>
         <w:tc>
           <w:tcPr>
-            <w:tcW w:w="3612" w:type="dxa"/>
+            <w:tcW w:w="4145" w:type="dxa"/>
           </w:tcPr>
           <w:p>
             <w:pPr>
+              <w:spacing w:after="0" w:line="228" w:lineRule="auto"/>
               <w:rPr>
                 <w:lang w:val="es-PY"/>
               </w:rPr>
@@ -8791,10 +9219,11 @@
         </w:trPr>
         <w:tc>
           <w:tcPr>
-            <w:tcW w:w="4400" w:type="dxa"/>
+            <w:tcW w:w="5049" w:type="dxa"/>
           </w:tcPr>
           <w:p>
             <w:pPr>
+              <w:spacing w:after="0" w:line="228" w:lineRule="auto"/>
               <w:rPr>
                 <w:lang w:val="es-PY"/>
               </w:rPr>
@@ -8811,9 +9240,12 @@
         </w:tc>
         <w:tc>
           <w:tcPr>
-            <w:tcW w:w="1400" w:type="dxa"/>
+            <w:tcW w:w="1607" w:type="dxa"/>
           </w:tcPr>
           <w:p>
+            <w:pPr>
+              <w:spacing w:after="0" w:line="228" w:lineRule="auto"/>
+            </w:pPr>
             <w:r>
               <w:rPr>
                 <w:b/>
@@ -8825,10 +9257,11 @@
         </w:tc>
         <w:tc>
           <w:tcPr>
-            <w:tcW w:w="3612" w:type="dxa"/>
+            <w:tcW w:w="4145" w:type="dxa"/>
           </w:tcPr>
           <w:p>
             <w:pPr>
+              <w:spacing w:after="0" w:line="228" w:lineRule="auto"/>
               <w:rPr>
                 <w:lang w:val="es-PY"/>
               </w:rPr>
@@ -8849,9 +9282,12 @@
         </w:trPr>
         <w:tc>
           <w:tcPr>
-            <w:tcW w:w="4400" w:type="dxa"/>
+            <w:tcW w:w="5049" w:type="dxa"/>
           </w:tcPr>
           <w:p>
+            <w:pPr>
+              <w:spacing w:after="0" w:line="228" w:lineRule="auto"/>
+            </w:pPr>
             <w:proofErr w:type="spellStart"/>
             <w:r>
               <w:rPr>
@@ -8881,9 +9317,12 @@
         </w:tc>
         <w:tc>
           <w:tcPr>
-            <w:tcW w:w="1400" w:type="dxa"/>
+            <w:tcW w:w="1607" w:type="dxa"/>
           </w:tcPr>
           <w:p>
+            <w:pPr>
+              <w:spacing w:after="0" w:line="228" w:lineRule="auto"/>
+            </w:pPr>
             <w:r>
               <w:rPr>
                 <w:b/>
@@ -8895,10 +9334,11 @@
         </w:tc>
         <w:tc>
           <w:tcPr>
-            <w:tcW w:w="3612" w:type="dxa"/>
+            <w:tcW w:w="4145" w:type="dxa"/>
           </w:tcPr>
           <w:p>
             <w:pPr>
+              <w:spacing w:after="0" w:line="228" w:lineRule="auto"/>
               <w:rPr>
                 <w:lang w:val="es-PY"/>
               </w:rPr>
@@ -8919,9 +9359,12 @@
         </w:trPr>
         <w:tc>
           <w:tcPr>
-            <w:tcW w:w="4400" w:type="dxa"/>
+            <w:tcW w:w="5049" w:type="dxa"/>
           </w:tcPr>
           <w:p>
+            <w:pPr>
+              <w:spacing w:after="0" w:line="228" w:lineRule="auto"/>
+            </w:pPr>
             <w:r>
               <w:rPr>
                 <w:b/>
@@ -8949,9 +9392,12 @@
         </w:tc>
         <w:tc>
           <w:tcPr>
-            <w:tcW w:w="1400" w:type="dxa"/>
+            <w:tcW w:w="1607" w:type="dxa"/>
           </w:tcPr>
           <w:p>
+            <w:pPr>
+              <w:spacing w:after="0" w:line="228" w:lineRule="auto"/>
+            </w:pPr>
             <w:r>
               <w:rPr>
                 <w:b/>
@@ -8963,10 +9409,11 @@
         </w:tc>
         <w:tc>
           <w:tcPr>
-            <w:tcW w:w="3612" w:type="dxa"/>
+            <w:tcW w:w="4145" w:type="dxa"/>
           </w:tcPr>
           <w:p>
             <w:pPr>
+              <w:spacing w:after="0" w:line="228" w:lineRule="auto"/>
               <w:rPr>
                 <w:lang w:val="es-PY"/>
               </w:rPr>
@@ -8987,9 +9434,12 @@
         </w:trPr>
         <w:tc>
           <w:tcPr>
-            <w:tcW w:w="4400" w:type="dxa"/>
+            <w:tcW w:w="5049" w:type="dxa"/>
           </w:tcPr>
           <w:p>
+            <w:pPr>
+              <w:spacing w:after="0" w:line="228" w:lineRule="auto"/>
+            </w:pPr>
             <w:proofErr w:type="spellStart"/>
             <w:r>
               <w:rPr>
@@ -9035,9 +9485,12 @@
         </w:tc>
         <w:tc>
           <w:tcPr>
-            <w:tcW w:w="1400" w:type="dxa"/>
+            <w:tcW w:w="1607" w:type="dxa"/>
           </w:tcPr>
           <w:p>
+            <w:pPr>
+              <w:spacing w:after="0" w:line="228" w:lineRule="auto"/>
+            </w:pPr>
             <w:r>
               <w:rPr>
                 <w:b/>
@@ -9049,10 +9502,11 @@
         </w:tc>
         <w:tc>
           <w:tcPr>
-            <w:tcW w:w="3612" w:type="dxa"/>
+            <w:tcW w:w="4145" w:type="dxa"/>
           </w:tcPr>
           <w:p>
             <w:pPr>
+              <w:spacing w:after="0" w:line="228" w:lineRule="auto"/>
               <w:rPr>
                 <w:lang w:val="es-PY"/>
               </w:rPr>
@@ -9069,6 +9523,9 @@
       </w:tr>
     </w:tbl>
     <w:p>
+      <w:pPr>
+        <w:spacing w:after="0" w:line="228" w:lineRule="auto"/>
+      </w:pPr>
       <w:r>
         <w:rPr>
           <w:b/>
@@ -9077,13 +9534,9 @@
       </w:r>
     </w:p>
     <w:p>
-      <w:r>
-        <w:br w:type="page"/>
-      </w:r>
-    </w:p>
-    <w:p>
       <w:pPr>
         <w:pStyle w:val="Ttulo1"/>
+        <w:pageBreakBefore/>
       </w:pPr>
       <w:r>
         <w:t xml:space="preserve">Quinta parte — Fichas de profundización</w:t>
@@ -9236,8 +9689,8 @@
       <w:footerReference w:type="default" r:id="rId8"/>
       <w:footerReference w:type="first" r:id="rId12"/>
       <w:headerReference w:type="first" r:id="rId13"/>
-      <w:pgSz w:w="11906" w:h="16838"/>
-      <w:pgMar w:top="1134" w:right="1247" w:bottom="1134" w:left="1247" w:header="720" w:footer="720" w:gutter="0"/>
+      <w:pgSz w:w="12240" w:h="18720"/>
+      <w:pgMar w:top="720" w:right="720" w:bottom="720" w:left="720" w:header="708" w:footer="708" w:gutter="0"/>
       <w:cols w:space="720"/>
       <w:titlePg/>
       <w:docGrid w:linePitch="360"/>

</xml_diff>